<commit_message>
Added link for Small Claims Overview form 84 info; replaced link for Collecting a Small Claims Judgment
</commit_message>
<xml_diff>
--- a/docassemble/SmallClClaimAndAffidavit/data/templates/small_claims_checklist.docx
+++ b/docassemble/SmallClClaimAndAffidavit/data/templates/small_claims_checklist.docx
@@ -1,6 +1,6 @@
 
 <file path=word/document.xml><?xml version="1.0" encoding="utf-8"?>
-<w:document xmlns:wpc="http://schemas.microsoft.com/office/word/2010/wordprocessingCanvas" xmlns:cx="http://schemas.microsoft.com/office/drawing/2014/chartex" xmlns:cx1="http://schemas.microsoft.com/office/drawing/2015/9/8/chartex" xmlns:cx2="http://schemas.microsoft.com/office/drawing/2015/10/21/chartex" xmlns:cx3="http://schemas.microsoft.com/office/drawing/2016/5/9/chartex" xmlns:cx4="http://schemas.microsoft.com/office/drawing/2016/5/10/chartex" xmlns:cx5="http://schemas.microsoft.com/office/drawing/2016/5/11/chartex" xmlns:cx6="http://schemas.microsoft.com/office/drawing/2016/5/12/chartex" xmlns:cx7="http://schemas.microsoft.com/office/drawing/2016/5/13/chartex" xmlns:cx8="http://schemas.microsoft.com/office/drawing/2016/5/14/chartex" xmlns:mc="http://schemas.openxmlformats.org/markup-compatibility/2006" xmlns:aink="http://schemas.microsoft.com/office/drawing/2016/ink" xmlns:am3d="http://schemas.microsoft.com/office/drawing/2017/model3d" xmlns:o="urn:schemas-microsoft-com:office:office" xmlns:oel="http://schemas.microsoft.com/office/2019/extlst" xmlns:r="http://schemas.openxmlformats.org/officeDocument/2006/relationships" xmlns:m="http://schemas.openxmlformats.org/officeDocument/2006/math" xmlns:v="urn:schemas-microsoft-com:vml" xmlns:wp14="http://schemas.microsoft.com/office/word/2010/wordprocessingDrawing" xmlns:wp="http://schemas.openxmlformats.org/drawingml/2006/wordprocessingDrawing" xmlns:w10="urn:schemas-microsoft-com:office:word" xmlns:w="http://schemas.openxmlformats.org/wordprocessingml/2006/main" xmlns:w14="http://schemas.microsoft.com/office/word/2010/wordml" xmlns:w15="http://schemas.microsoft.com/office/word/2012/wordml" xmlns:w16cex="http://schemas.microsoft.com/office/word/2018/wordml/cex" xmlns:w16cid="http://schemas.microsoft.com/office/word/2016/wordml/cid" xmlns:w16="http://schemas.microsoft.com/office/word/2018/wordml" xmlns:w16du="http://schemas.microsoft.com/office/word/2023/wordml/word16du" xmlns:w16sdtdh="http://schemas.microsoft.com/office/word/2020/wordml/sdtdatahash" xmlns:w16sdtfl="http://schemas.microsoft.com/office/word/2024/wordml/sdtformatlock" xmlns:w16se="http://schemas.microsoft.com/office/word/2015/wordml/symex" xmlns:wpg="http://schemas.microsoft.com/office/word/2010/wordprocessingGroup" xmlns:wpi="http://schemas.microsoft.com/office/word/2010/wordprocessingInk" xmlns:wne="http://schemas.microsoft.com/office/word/2006/wordml" xmlns:wps="http://schemas.microsoft.com/office/word/2010/wordprocessingShape" mc:Ignorable="w14 w15 w16se w16cid w16 w16cex w16sdtdh w16sdtfl w16du wp14">
+<w:document xmlns:wpc="http://schemas.microsoft.com/office/word/2010/wordprocessingCanvas" xmlns:cx="http://schemas.microsoft.com/office/drawing/2014/chartex" xmlns:cx1="http://schemas.microsoft.com/office/drawing/2015/9/8/chartex" xmlns:cx2="http://schemas.microsoft.com/office/drawing/2015/10/21/chartex" xmlns:cx3="http://schemas.microsoft.com/office/drawing/2016/5/9/chartex" xmlns:cx4="http://schemas.microsoft.com/office/drawing/2016/5/10/chartex" xmlns:cx5="http://schemas.microsoft.com/office/drawing/2016/5/11/chartex" xmlns:cx6="http://schemas.microsoft.com/office/drawing/2016/5/12/chartex" xmlns:cx7="http://schemas.microsoft.com/office/drawing/2016/5/13/chartex" xmlns:cx8="http://schemas.microsoft.com/office/drawing/2016/5/14/chartex" xmlns:mc="http://schemas.openxmlformats.org/markup-compatibility/2006" xmlns:m="http://schemas.openxmlformats.org/officeDocument/2006/math" xmlns:aink="http://schemas.microsoft.com/office/drawing/2016/ink" xmlns:am3d="http://schemas.microsoft.com/office/drawing/2017/model3d" xmlns:oel="http://schemas.microsoft.com/office/2019/extlst" xmlns:r="http://schemas.openxmlformats.org/officeDocument/2006/relationships" xmlns:wp14="http://schemas.microsoft.com/office/word/2010/wordprocessingDrawing" xmlns:wp="http://schemas.openxmlformats.org/drawingml/2006/wordprocessingDrawing" xmlns:wpg="http://schemas.microsoft.com/office/word/2010/wordprocessingGroup" xmlns:wpi="http://schemas.microsoft.com/office/word/2010/wordprocessingInk" xmlns:wps="http://schemas.microsoft.com/office/word/2010/wordprocessingShape" xmlns:o="urn:schemas-microsoft-com:office:office" xmlns:v="urn:schemas-microsoft-com:vml" xmlns:w10="urn:schemas-microsoft-com:office:word" xmlns:w="http://schemas.openxmlformats.org/wordprocessingml/2006/main" xmlns:w14="http://schemas.microsoft.com/office/word/2010/wordml" xmlns:w15="http://schemas.microsoft.com/office/word/2012/wordml" xmlns:w16cex="http://schemas.microsoft.com/office/word/2018/wordml/cex" xmlns:w16cid="http://schemas.microsoft.com/office/word/2016/wordml/cid" xmlns:w16="http://schemas.microsoft.com/office/word/2018/wordml" xmlns:w16sdtdh="http://schemas.microsoft.com/office/word/2020/wordml/sdtdatahash" xmlns:w16sdtfl="http://schemas.microsoft.com/office/word/2024/wordml/sdtformatlock" xmlns:w16se="http://schemas.microsoft.com/office/word/2015/wordml/symex" xmlns:w16du="http://schemas.microsoft.com/office/word/2023/wordml/word16du" xmlns:wne="http://schemas.microsoft.com/office/word/2006/wordml" mc:Ignorable="w14 w15 w16se w16cid w16 w16cex w16sdtdh w16sdtfl w16du wp14">
   <w:body>
     <w:p>
       <w:bookmarkStart w:id="0" w:name="_heading=h.dq0av64i9ak" w:colFirst="0" w:colLast="0"/>
@@ -12,23 +12,7 @@
         <w:t xml:space="preserve"> </w:t>
       </w:r>
       <w:r>
-        <w:t>include_docx_template('</w:t>
-      </w:r>
-      <w:proofErr w:type="gramStart"/>
-      <w:r>
-        <w:t>docassemble.mlhframework</w:t>
-      </w:r>
-      <w:proofErr w:type="gramEnd"/>
-      <w:r>
-        <w:t>:data/templates/cover_sheet_2.0.docx'</w:t>
-      </w:r>
-      <w:proofErr w:type="gramStart"/>
-      <w:r>
-        <w:t>) }</w:t>
-      </w:r>
-      <w:proofErr w:type="gramEnd"/>
-      <w:r>
-        <w:t>}</w:t>
+        <w:t>include_docx_template('docassemble.mlhframework:data/templates/cover_sheet_2.0.docx') }}</w:t>
       </w:r>
     </w:p>
     <w:p/>
@@ -95,7 +79,6 @@
           <w:u w:val="single"/>
         </w:rPr>
       </w:pPr>
-      <w:proofErr w:type="gramStart"/>
       <w:r>
         <w:rPr>
           <w:rFonts w:cs="Times New Roman"/>
@@ -109,16 +92,7 @@
           <w:noProof/>
           <w:szCs w:val="28"/>
         </w:rPr>
-        <w:t xml:space="preserve"> cover</w:t>
-      </w:r>
-      <w:proofErr w:type="gramEnd"/>
-      <w:r>
-        <w:rPr>
-          <w:rFonts w:cs="Times New Roman"/>
-          <w:noProof/>
-          <w:szCs w:val="28"/>
-        </w:rPr>
-        <w:t xml:space="preserve">_sheet_thanks </w:t>
+        <w:t xml:space="preserve"> cover_sheet_thanks </w:t>
       </w:r>
       <w:r>
         <w:rPr>
@@ -170,6 +144,20 @@
       <w:r>
         <w:t>Step 1: Prepare your forms and find out how you will file</w:t>
       </w:r>
+      <w:r>
+        <w:t xml:space="preserve">. For more information on small claims, review the </w:t>
+      </w:r>
+      <w:hyperlink r:id="rId7" w:history="1">
+        <w:r>
+          <w:rPr>
+            <w:rStyle w:val="Hyperlink"/>
+          </w:rPr>
+          <w:t>Small Claims Overview form 84 info</w:t>
+        </w:r>
+      </w:hyperlink>
+      <w:r>
+        <w:t>.</w:t>
+      </w:r>
     </w:p>
     <w:p>
       <w:pPr>
@@ -191,7 +179,7 @@
         </w:rPr>
         <w:t xml:space="preserve">Use the </w:t>
       </w:r>
-      <w:hyperlink r:id="rId7">
+      <w:hyperlink r:id="rId8">
         <w:r>
           <w:rPr>
             <w:color w:val="0563C1"/>
@@ -323,7 +311,7 @@
         </w:rPr>
         <w:t xml:space="preserve">You can find contact information for your court on the </w:t>
       </w:r>
-      <w:hyperlink r:id="rId8">
+      <w:hyperlink r:id="rId9">
         <w:r>
           <w:rPr>
             <w:color w:val="1155CC"/>
@@ -344,7 +332,7 @@
         <w:shd w:val="clear" w:color="auto" w:fill="FFFFFF"/>
         <w:spacing w:after="160" w:line="276" w:lineRule="auto"/>
       </w:pPr>
-      <w:hyperlink r:id="rId9">
+      <w:hyperlink r:id="rId10">
         <w:proofErr w:type="spellStart"/>
         <w:r>
           <w:rPr>
@@ -359,23 +347,9 @@
         <w:rPr>
           <w:color w:val="222222"/>
         </w:rPr>
-        <w:t xml:space="preserve"> is only available for </w:t>
-      </w:r>
-      <w:proofErr w:type="gramStart"/>
-      <w:r>
-        <w:rPr>
-          <w:color w:val="222222"/>
-        </w:rPr>
-        <w:t>some courts</w:t>
-      </w:r>
-      <w:proofErr w:type="gramEnd"/>
-      <w:r>
-        <w:rPr>
-          <w:color w:val="222222"/>
-        </w:rPr>
-        <w:t xml:space="preserve">. Even in courts where it is available, you can only use it for some case types. The State Court Administrative Office keeps a </w:t>
-      </w:r>
-      <w:hyperlink r:id="rId10">
+        <w:t xml:space="preserve"> is only available for some courts. Even in courts where it is available, you can only use it for some case types. The State Court Administrative Office keeps a </w:t>
+      </w:r>
+      <w:hyperlink r:id="rId11">
         <w:r>
           <w:rPr>
             <w:color w:val="1155CC"/>
@@ -390,7 +364,7 @@
         </w:rPr>
         <w:t xml:space="preserve">. To learn more, read </w:t>
       </w:r>
-      <w:hyperlink r:id="rId11">
+      <w:hyperlink r:id="rId12">
         <w:r>
           <w:rPr>
             <w:color w:val="1155CC"/>
@@ -488,21 +462,7 @@
         <w:rPr>
           <w:color w:val="222222"/>
         </w:rPr>
-        <w:t xml:space="preserve">If you're signing the Affidavit and Claim in front of a court clerk, make four copies before you sign your documents. Make at least one copy of your judgment. Bring </w:t>
-      </w:r>
-      <w:proofErr w:type="gramStart"/>
-      <w:r>
-        <w:rPr>
-          <w:color w:val="222222"/>
-        </w:rPr>
-        <w:t>all of</w:t>
-      </w:r>
-      <w:proofErr w:type="gramEnd"/>
-      <w:r>
-        <w:rPr>
-          <w:color w:val="222222"/>
-        </w:rPr>
-        <w:t xml:space="preserve"> the copies with you to the court clerk.</w:t>
+        <w:t>If you're signing the Affidavit and Claim in front of a court clerk, make four copies before you sign your documents. Make at least one copy of your judgment. Bring all of the copies with you to the court clerk.</w:t>
       </w:r>
     </w:p>
     <w:p>
@@ -615,21 +575,7 @@
         <w:rPr>
           <w:color w:val="222222"/>
         </w:rPr>
-        <w:t xml:space="preserve">The case-type code for small claims cases is "SC." Look for your court on the </w:t>
-      </w:r>
-      <w:proofErr w:type="gramStart"/>
-      <w:r>
-        <w:rPr>
-          <w:color w:val="222222"/>
-        </w:rPr>
-        <w:t>chart, and</w:t>
-      </w:r>
-      <w:proofErr w:type="gramEnd"/>
-      <w:r>
-        <w:rPr>
-          <w:color w:val="222222"/>
-        </w:rPr>
-        <w:t xml:space="preserve"> then check to see if "SC" is listed as one of the case types they take for e-Filing. </w:t>
+        <w:t xml:space="preserve">The case-type code for small claims cases is "SC." Look for your court on the chart, and then check to see if "SC" is listed as one of the case types they take for e-Filing. </w:t>
       </w:r>
     </w:p>
     <w:p>
@@ -769,7 +715,7 @@
         </w:rPr>
         <w:t xml:space="preserve">If you can’t afford to pay the filing fee, you can ask the court to waive your fees. The form you can use for this is the </w:t>
       </w:r>
-      <w:hyperlink r:id="rId12">
+      <w:hyperlink r:id="rId13">
         <w:r>
           <w:rPr>
             <w:color w:val="0563C1"/>
@@ -782,21 +728,7 @@
         <w:rPr>
           <w:color w:val="000000"/>
         </w:rPr>
-        <w:t xml:space="preserve"> tool. Your case will not start until you pay the filing </w:t>
-      </w:r>
-      <w:proofErr w:type="gramStart"/>
-      <w:r>
-        <w:rPr>
-          <w:color w:val="000000"/>
-        </w:rPr>
-        <w:t>fee</w:t>
-      </w:r>
-      <w:proofErr w:type="gramEnd"/>
-      <w:r>
-        <w:rPr>
-          <w:color w:val="000000"/>
-        </w:rPr>
-        <w:t xml:space="preserve"> or the fee waiver is approved.</w:t>
+        <w:t xml:space="preserve"> tool. Your case will not start until you pay the filing fee or the fee waiver is approved.</w:t>
       </w:r>
     </w:p>
     <w:p>
@@ -1108,16 +1040,8 @@
         <w:rPr>
           <w:color w:val="000000"/>
         </w:rPr>
-        <w:t xml:space="preserve">Any witnesses you ask to </w:t>
-      </w:r>
-      <w:proofErr w:type="gramStart"/>
-      <w:r>
-        <w:rPr>
-          <w:color w:val="000000"/>
-        </w:rPr>
-        <w:t>speak</w:t>
-      </w:r>
-      <w:proofErr w:type="gramEnd"/>
+        <w:t>Any witnesses you ask to speak</w:t>
+      </w:r>
       <w:r>
         <w:rPr>
           <w:color w:val="000000"/>
@@ -1147,7 +1071,7 @@
         </w:rPr>
         <w:t xml:space="preserve">Information about appearing in court is available in the article </w:t>
       </w:r>
-      <w:hyperlink r:id="rId13">
+      <w:hyperlink r:id="rId14">
         <w:r>
           <w:rPr>
             <w:color w:val="1155CC"/>
@@ -1254,21 +1178,7 @@
         <w:rPr>
           <w:color w:val="000000"/>
         </w:rPr>
-        <w:t xml:space="preserve">Remember that when people represent themselves in court, they are expected to follow the same </w:t>
-      </w:r>
-      <w:proofErr w:type="gramStart"/>
-      <w:r>
-        <w:rPr>
-          <w:color w:val="000000"/>
-        </w:rPr>
-        <w:t>rules</w:t>
-      </w:r>
-      <w:proofErr w:type="gramEnd"/>
-      <w:r>
-        <w:rPr>
-          <w:color w:val="000000"/>
-        </w:rPr>
-        <w:t xml:space="preserve"> an attorney does.</w:t>
+        <w:t>Remember that when people represent themselves in court, they are expected to follow the same rules an attorney does.</w:t>
       </w:r>
     </w:p>
     <w:p>
@@ -1310,21 +1220,7 @@
         <w:rPr>
           <w:color w:val="000000"/>
         </w:rPr>
-        <w:t xml:space="preserve">Answer the judge’s or magistrate’s questions clearly and directly. If the judge or magistrate wants to hear from your other witnesses, ask them to tell the court what they know or </w:t>
-      </w:r>
-      <w:proofErr w:type="gramStart"/>
-      <w:r>
-        <w:rPr>
-          <w:color w:val="000000"/>
-        </w:rPr>
-        <w:t>saw</w:t>
-      </w:r>
-      <w:proofErr w:type="gramEnd"/>
-      <w:r>
-        <w:rPr>
-          <w:color w:val="000000"/>
-        </w:rPr>
-        <w:t xml:space="preserve"> regarding your situation.</w:t>
+        <w:t>Answer the judge’s or magistrate’s questions clearly and directly. If the judge or magistrate wants to hear from your other witnesses, ask them to tell the court what they know or saw regarding your situation.</w:t>
       </w:r>
     </w:p>
     <w:p>
@@ -1433,7 +1329,7 @@
         </w:rPr>
         <w:t xml:space="preserve">If the court finds in your favor, and the judgment is not paid immediately, you will need to take steps to collect the money. See the One Court of Justice website about </w:t>
       </w:r>
-      <w:hyperlink r:id="rId14">
+      <w:hyperlink r:id="rId15">
         <w:r>
           <w:rPr>
             <w:color w:val="0563C1"/>
@@ -1448,7 +1344,7 @@
         </w:rPr>
         <w:t xml:space="preserve">, or our article </w:t>
       </w:r>
-      <w:hyperlink r:id="rId15">
+      <w:hyperlink r:id="rId16">
         <w:r>
           <w:rPr>
             <w:color w:val="0563C1"/>
@@ -1475,7 +1371,7 @@
 </file>
 
 <file path=word/numbering.xml><?xml version="1.0" encoding="utf-8"?>
-<w:numbering xmlns:wpc="http://schemas.microsoft.com/office/word/2010/wordprocessingCanvas" xmlns:cx="http://schemas.microsoft.com/office/drawing/2014/chartex" xmlns:cx1="http://schemas.microsoft.com/office/drawing/2015/9/8/chartex" xmlns:cx2="http://schemas.microsoft.com/office/drawing/2015/10/21/chartex" xmlns:cx3="http://schemas.microsoft.com/office/drawing/2016/5/9/chartex" xmlns:cx4="http://schemas.microsoft.com/office/drawing/2016/5/10/chartex" xmlns:cx5="http://schemas.microsoft.com/office/drawing/2016/5/11/chartex" xmlns:cx6="http://schemas.microsoft.com/office/drawing/2016/5/12/chartex" xmlns:cx7="http://schemas.microsoft.com/office/drawing/2016/5/13/chartex" xmlns:cx8="http://schemas.microsoft.com/office/drawing/2016/5/14/chartex" xmlns:mc="http://schemas.openxmlformats.org/markup-compatibility/2006" xmlns:aink="http://schemas.microsoft.com/office/drawing/2016/ink" xmlns:am3d="http://schemas.microsoft.com/office/drawing/2017/model3d" xmlns:o="urn:schemas-microsoft-com:office:office" xmlns:oel="http://schemas.microsoft.com/office/2019/extlst" xmlns:r="http://schemas.openxmlformats.org/officeDocument/2006/relationships" xmlns:m="http://schemas.openxmlformats.org/officeDocument/2006/math" xmlns:v="urn:schemas-microsoft-com:vml" xmlns:wp14="http://schemas.microsoft.com/office/word/2010/wordprocessingDrawing" xmlns:wp="http://schemas.openxmlformats.org/drawingml/2006/wordprocessingDrawing" xmlns:w10="urn:schemas-microsoft-com:office:word" xmlns:w="http://schemas.openxmlformats.org/wordprocessingml/2006/main" xmlns:w14="http://schemas.microsoft.com/office/word/2010/wordml" xmlns:w15="http://schemas.microsoft.com/office/word/2012/wordml" xmlns:w16cex="http://schemas.microsoft.com/office/word/2018/wordml/cex" xmlns:w16cid="http://schemas.microsoft.com/office/word/2016/wordml/cid" xmlns:w16="http://schemas.microsoft.com/office/word/2018/wordml" xmlns:w16du="http://schemas.microsoft.com/office/word/2023/wordml/word16du" xmlns:w16sdtdh="http://schemas.microsoft.com/office/word/2020/wordml/sdtdatahash" xmlns:w16sdtfl="http://schemas.microsoft.com/office/word/2024/wordml/sdtformatlock" xmlns:w16se="http://schemas.microsoft.com/office/word/2015/wordml/symex" xmlns:wpg="http://schemas.microsoft.com/office/word/2010/wordprocessingGroup" xmlns:wpi="http://schemas.microsoft.com/office/word/2010/wordprocessingInk" xmlns:wne="http://schemas.microsoft.com/office/word/2006/wordml" xmlns:wps="http://schemas.microsoft.com/office/word/2010/wordprocessingShape" mc:Ignorable="w14 w15 w16se w16cid w16 w16cex w16sdtdh w16sdtfl w16du wp14">
+<w:numbering xmlns:wpc="http://schemas.microsoft.com/office/word/2010/wordprocessingCanvas" xmlns:cx="http://schemas.microsoft.com/office/drawing/2014/chartex" xmlns:cx1="http://schemas.microsoft.com/office/drawing/2015/9/8/chartex" xmlns:cx2="http://schemas.microsoft.com/office/drawing/2015/10/21/chartex" xmlns:cx3="http://schemas.microsoft.com/office/drawing/2016/5/9/chartex" xmlns:cx4="http://schemas.microsoft.com/office/drawing/2016/5/10/chartex" xmlns:cx5="http://schemas.microsoft.com/office/drawing/2016/5/11/chartex" xmlns:cx6="http://schemas.microsoft.com/office/drawing/2016/5/12/chartex" xmlns:cx7="http://schemas.microsoft.com/office/drawing/2016/5/13/chartex" xmlns:cx8="http://schemas.microsoft.com/office/drawing/2016/5/14/chartex" xmlns:mc="http://schemas.openxmlformats.org/markup-compatibility/2006" xmlns:m="http://schemas.openxmlformats.org/officeDocument/2006/math" xmlns:aink="http://schemas.microsoft.com/office/drawing/2016/ink" xmlns:am3d="http://schemas.microsoft.com/office/drawing/2017/model3d" xmlns:oel="http://schemas.microsoft.com/office/2019/extlst" xmlns:r="http://schemas.openxmlformats.org/officeDocument/2006/relationships" xmlns:wp14="http://schemas.microsoft.com/office/word/2010/wordprocessingDrawing" xmlns:wp="http://schemas.openxmlformats.org/drawingml/2006/wordprocessingDrawing" xmlns:wpg="http://schemas.microsoft.com/office/word/2010/wordprocessingGroup" xmlns:wpi="http://schemas.microsoft.com/office/word/2010/wordprocessingInk" xmlns:wps="http://schemas.microsoft.com/office/word/2010/wordprocessingShape" xmlns:o="urn:schemas-microsoft-com:office:office" xmlns:v="urn:schemas-microsoft-com:vml" xmlns:w10="urn:schemas-microsoft-com:office:word" xmlns:w="http://schemas.openxmlformats.org/wordprocessingml/2006/main" xmlns:w14="http://schemas.microsoft.com/office/word/2010/wordml" xmlns:w15="http://schemas.microsoft.com/office/word/2012/wordml" xmlns:w16cex="http://schemas.microsoft.com/office/word/2018/wordml/cex" xmlns:w16cid="http://schemas.microsoft.com/office/word/2016/wordml/cid" xmlns:w16="http://schemas.microsoft.com/office/word/2018/wordml" xmlns:w16sdtdh="http://schemas.microsoft.com/office/word/2020/wordml/sdtdatahash" xmlns:w16sdtfl="http://schemas.microsoft.com/office/word/2024/wordml/sdtformatlock" xmlns:w16se="http://schemas.microsoft.com/office/word/2015/wordml/symex" xmlns:w16du="http://schemas.microsoft.com/office/word/2023/wordml/word16du" xmlns:wne="http://schemas.microsoft.com/office/word/2006/wordml" mc:Ignorable="w14 w15 w16se w16cid w16 w16cex w16sdtdh w16sdtfl w16du wp14">
   <w:abstractNum w:abstractNumId="0" w15:restartNumberingAfterBreak="0">
     <w:nsid w:val="2C92161A"/>
     <w:multiLevelType w:val="multilevel"/>
@@ -1834,7 +1730,7 @@
 </file>
 
 <file path=word/styles.xml><?xml version="1.0" encoding="utf-8"?>
-<w:styles xmlns:mc="http://schemas.openxmlformats.org/markup-compatibility/2006" xmlns:r="http://schemas.openxmlformats.org/officeDocument/2006/relationships" xmlns:w="http://schemas.openxmlformats.org/wordprocessingml/2006/main" xmlns:w14="http://schemas.microsoft.com/office/word/2010/wordml" xmlns:w15="http://schemas.microsoft.com/office/word/2012/wordml" xmlns:w16cex="http://schemas.microsoft.com/office/word/2018/wordml/cex" xmlns:w16cid="http://schemas.microsoft.com/office/word/2016/wordml/cid" xmlns:w16="http://schemas.microsoft.com/office/word/2018/wordml" xmlns:w16du="http://schemas.microsoft.com/office/word/2023/wordml/word16du" xmlns:w16sdtdh="http://schemas.microsoft.com/office/word/2020/wordml/sdtdatahash" xmlns:w16sdtfl="http://schemas.microsoft.com/office/word/2024/wordml/sdtformatlock" xmlns:w16se="http://schemas.microsoft.com/office/word/2015/wordml/symex" mc:Ignorable="w14 w15 w16se w16cid w16 w16cex w16sdtdh w16sdtfl w16du">
+<w:styles xmlns:mc="http://schemas.openxmlformats.org/markup-compatibility/2006" xmlns:r="http://schemas.openxmlformats.org/officeDocument/2006/relationships" xmlns:w="http://schemas.openxmlformats.org/wordprocessingml/2006/main" xmlns:w14="http://schemas.microsoft.com/office/word/2010/wordml" xmlns:w15="http://schemas.microsoft.com/office/word/2012/wordml" xmlns:w16cex="http://schemas.microsoft.com/office/word/2018/wordml/cex" xmlns:w16cid="http://schemas.microsoft.com/office/word/2016/wordml/cid" xmlns:w16="http://schemas.microsoft.com/office/word/2018/wordml" xmlns:w16sdtdh="http://schemas.microsoft.com/office/word/2020/wordml/sdtdatahash" xmlns:w16sdtfl="http://schemas.microsoft.com/office/word/2024/wordml/sdtformatlock" xmlns:w16se="http://schemas.microsoft.com/office/word/2015/wordml/symex" xmlns:w16du="http://schemas.microsoft.com/office/word/2023/wordml/word16du" mc:Ignorable="w14 w15 w16se w16cid w16 w16cex w16sdtdh w16sdtfl w16du">
   <w:docDefaults>
     <w:rPrDefault>
       <w:rPr>
@@ -2524,6 +2420,18 @@
       <w:szCs w:val="48"/>
     </w:rPr>
   </w:style>
+  <w:style w:type="character" w:styleId="UnresolvedMention">
+    <w:name w:val="Unresolved Mention"/>
+    <w:basedOn w:val="DefaultParagraphFont"/>
+    <w:uiPriority w:val="99"/>
+    <w:semiHidden/>
+    <w:unhideWhenUsed/>
+    <w:rsid w:val="00151F6E"/>
+    <w:rPr>
+      <w:color w:val="605E5C"/>
+      <w:shd w:val="clear" w:color="auto" w:fill="E1DFDD"/>
+    </w:rPr>
+  </w:style>
 </w:styles>
 </file>
 

</xml_diff>

<commit_message>
Incorporated new title in Instructions templaye doc
</commit_message>
<xml_diff>
--- a/docassemble/SmallClClaimAndAffidavit/data/templates/small_claims_checklist.docx
+++ b/docassemble/SmallClClaimAndAffidavit/data/templates/small_claims_checklist.docx
@@ -1,6 +1,6 @@
 
 <file path=word/document.xml><?xml version="1.0" encoding="utf-8"?>
-<w:document xmlns:wpc="http://schemas.microsoft.com/office/word/2010/wordprocessingCanvas" xmlns:cx="http://schemas.microsoft.com/office/drawing/2014/chartex" xmlns:cx1="http://schemas.microsoft.com/office/drawing/2015/9/8/chartex" xmlns:cx2="http://schemas.microsoft.com/office/drawing/2015/10/21/chartex" xmlns:cx3="http://schemas.microsoft.com/office/drawing/2016/5/9/chartex" xmlns:cx4="http://schemas.microsoft.com/office/drawing/2016/5/10/chartex" xmlns:cx5="http://schemas.microsoft.com/office/drawing/2016/5/11/chartex" xmlns:cx6="http://schemas.microsoft.com/office/drawing/2016/5/12/chartex" xmlns:cx7="http://schemas.microsoft.com/office/drawing/2016/5/13/chartex" xmlns:cx8="http://schemas.microsoft.com/office/drawing/2016/5/14/chartex" xmlns:mc="http://schemas.openxmlformats.org/markup-compatibility/2006" xmlns:aink="http://schemas.microsoft.com/office/drawing/2016/ink" xmlns:am3d="http://schemas.microsoft.com/office/drawing/2017/model3d" xmlns:o="urn:schemas-microsoft-com:office:office" xmlns:oel="http://schemas.microsoft.com/office/2019/extlst" xmlns:r="http://schemas.openxmlformats.org/officeDocument/2006/relationships" xmlns:m="http://schemas.openxmlformats.org/officeDocument/2006/math" xmlns:v="urn:schemas-microsoft-com:vml" xmlns:wp14="http://schemas.microsoft.com/office/word/2010/wordprocessingDrawing" xmlns:wp="http://schemas.openxmlformats.org/drawingml/2006/wordprocessingDrawing" xmlns:w10="urn:schemas-microsoft-com:office:word" xmlns:w="http://schemas.openxmlformats.org/wordprocessingml/2006/main" xmlns:w14="http://schemas.microsoft.com/office/word/2010/wordml" xmlns:w15="http://schemas.microsoft.com/office/word/2012/wordml" xmlns:w16cex="http://schemas.microsoft.com/office/word/2018/wordml/cex" xmlns:w16cid="http://schemas.microsoft.com/office/word/2016/wordml/cid" xmlns:w16="http://schemas.microsoft.com/office/word/2018/wordml" xmlns:w16du="http://schemas.microsoft.com/office/word/2023/wordml/word16du" xmlns:w16sdtdh="http://schemas.microsoft.com/office/word/2020/wordml/sdtdatahash" xmlns:w16sdtfl="http://schemas.microsoft.com/office/word/2024/wordml/sdtformatlock" xmlns:w16se="http://schemas.microsoft.com/office/word/2015/wordml/symex" xmlns:wpg="http://schemas.microsoft.com/office/word/2010/wordprocessingGroup" xmlns:wpi="http://schemas.microsoft.com/office/word/2010/wordprocessingInk" xmlns:wne="http://schemas.microsoft.com/office/word/2006/wordml" xmlns:wps="http://schemas.microsoft.com/office/word/2010/wordprocessingShape" mc:Ignorable="w14 w15 w16se w16cid w16 w16cex w16sdtdh w16sdtfl w16du wp14">
+<w:document xmlns:wpc="http://schemas.microsoft.com/office/word/2010/wordprocessingCanvas" xmlns:cx="http://schemas.microsoft.com/office/drawing/2014/chartex" xmlns:cx1="http://schemas.microsoft.com/office/drawing/2015/9/8/chartex" xmlns:cx2="http://schemas.microsoft.com/office/drawing/2015/10/21/chartex" xmlns:cx3="http://schemas.microsoft.com/office/drawing/2016/5/9/chartex" xmlns:cx4="http://schemas.microsoft.com/office/drawing/2016/5/10/chartex" xmlns:cx5="http://schemas.microsoft.com/office/drawing/2016/5/11/chartex" xmlns:cx6="http://schemas.microsoft.com/office/drawing/2016/5/12/chartex" xmlns:cx7="http://schemas.microsoft.com/office/drawing/2016/5/13/chartex" xmlns:cx8="http://schemas.microsoft.com/office/drawing/2016/5/14/chartex" xmlns:mc="http://schemas.openxmlformats.org/markup-compatibility/2006" xmlns:m="http://schemas.openxmlformats.org/officeDocument/2006/math" xmlns:aink="http://schemas.microsoft.com/office/drawing/2016/ink" xmlns:am3d="http://schemas.microsoft.com/office/drawing/2017/model3d" xmlns:oel="http://schemas.microsoft.com/office/2019/extlst" xmlns:r="http://schemas.openxmlformats.org/officeDocument/2006/relationships" xmlns:wp14="http://schemas.microsoft.com/office/word/2010/wordprocessingDrawing" xmlns:wp="http://schemas.openxmlformats.org/drawingml/2006/wordprocessingDrawing" xmlns:wpg="http://schemas.microsoft.com/office/word/2010/wordprocessingGroup" xmlns:wpi="http://schemas.microsoft.com/office/word/2010/wordprocessingInk" xmlns:wps="http://schemas.microsoft.com/office/word/2010/wordprocessingShape" xmlns:o="urn:schemas-microsoft-com:office:office" xmlns:v="urn:schemas-microsoft-com:vml" xmlns:w10="urn:schemas-microsoft-com:office:word" xmlns:w="http://schemas.openxmlformats.org/wordprocessingml/2006/main" xmlns:w14="http://schemas.microsoft.com/office/word/2010/wordml" xmlns:w15="http://schemas.microsoft.com/office/word/2012/wordml" xmlns:w16cex="http://schemas.microsoft.com/office/word/2018/wordml/cex" xmlns:w16cid="http://schemas.microsoft.com/office/word/2016/wordml/cid" xmlns:w16="http://schemas.microsoft.com/office/word/2018/wordml" xmlns:w16sdtdh="http://schemas.microsoft.com/office/word/2020/wordml/sdtdatahash" xmlns:w16sdtfl="http://schemas.microsoft.com/office/word/2024/wordml/sdtformatlock" xmlns:w16se="http://schemas.microsoft.com/office/word/2015/wordml/symex" xmlns:w16du="http://schemas.microsoft.com/office/word/2023/wordml/word16du" xmlns:wne="http://schemas.microsoft.com/office/word/2006/wordml" mc:Ignorable="w14 w15 w16se w16cid w16 w16cex w16sdtdh w16sdtfl w16du wp14">
   <w:body>
     <w:p>
       <w:bookmarkStart w:id="0" w:name="_heading=h.dq0av64i9ak" w:colFirst="0" w:colLast="0"/>
@@ -12,23 +12,7 @@
         <w:t xml:space="preserve"> </w:t>
       </w:r>
       <w:r>
-        <w:t>include_docx_template('</w:t>
-      </w:r>
-      <w:proofErr w:type="gramStart"/>
-      <w:r>
-        <w:t>docassemble.mlhframework</w:t>
-      </w:r>
-      <w:proofErr w:type="gramEnd"/>
-      <w:r>
-        <w:t>:data/templates/cover_sheet_2.0.docx'</w:t>
-      </w:r>
-      <w:proofErr w:type="gramStart"/>
-      <w:r>
-        <w:t>) }</w:t>
-      </w:r>
-      <w:proofErr w:type="gramEnd"/>
-      <w:r>
-        <w:t>}</w:t>
+        <w:t>include_docx_template('docassemble.mlhframework:data/templates/cover_sheet_2.0.docx') }}</w:t>
       </w:r>
     </w:p>
     <w:p/>
@@ -95,7 +79,6 @@
           <w:u w:val="single"/>
         </w:rPr>
       </w:pPr>
-      <w:proofErr w:type="gramStart"/>
       <w:r>
         <w:rPr>
           <w:rFonts w:cs="Times New Roman"/>
@@ -109,16 +92,7 @@
           <w:noProof/>
           <w:szCs w:val="28"/>
         </w:rPr>
-        <w:t xml:space="preserve"> cover</w:t>
-      </w:r>
-      <w:proofErr w:type="gramEnd"/>
-      <w:r>
-        <w:rPr>
-          <w:rFonts w:cs="Times New Roman"/>
-          <w:noProof/>
-          <w:szCs w:val="28"/>
-        </w:rPr>
-        <w:t xml:space="preserve">_sheet_thanks </w:t>
+        <w:t xml:space="preserve"> cover_sheet_thanks </w:t>
       </w:r>
       <w:r>
         <w:rPr>
@@ -137,28 +111,69 @@
       </w:pPr>
       <w:r>
         <w:lastRenderedPageBreak/>
-        <w:t>Instructions – How to File an Affidavit and Claim in Small Claims Court</w:t>
-      </w:r>
-    </w:p>
-    <w:p>
-      <w:pPr>
-        <w:pBdr>
-          <w:top w:val="nil"/>
-          <w:left w:val="nil"/>
-          <w:bottom w:val="nil"/>
-          <w:right w:val="nil"/>
-          <w:between w:val="nil"/>
-        </w:pBdr>
-        <w:spacing w:after="160" w:line="276" w:lineRule="auto"/>
-        <w:rPr>
-          <w:color w:val="000000"/>
-        </w:rPr>
-      </w:pPr>
-      <w:r>
-        <w:rPr>
-          <w:color w:val="000000"/>
-        </w:rPr>
-        <w:t>These instructions will help you file your Affidavit and Claim in small claims court. You can print the instructions and use them as a checklist.</w:t>
+        <w:t xml:space="preserve">Instructions – How to File </w:t>
+      </w:r>
+      <w:proofErr w:type="gramStart"/>
+      <w:r>
+        <w:t>an</w:t>
+      </w:r>
+      <w:proofErr w:type="gramEnd"/>
+      <w:r>
+        <w:t xml:space="preserve"> Small </w:t>
+      </w:r>
+      <w:r>
+        <w:t>Claim</w:t>
+      </w:r>
+      <w:r>
+        <w:t>s Affidavit</w:t>
+      </w:r>
+      <w:r>
+        <w:t xml:space="preserve"> in Small Claims Court</w:t>
+      </w:r>
+    </w:p>
+    <w:p>
+      <w:pPr>
+        <w:pBdr>
+          <w:top w:val="nil"/>
+          <w:left w:val="nil"/>
+          <w:bottom w:val="nil"/>
+          <w:right w:val="nil"/>
+          <w:between w:val="nil"/>
+        </w:pBdr>
+        <w:spacing w:after="160" w:line="276" w:lineRule="auto"/>
+        <w:rPr>
+          <w:color w:val="000000"/>
+        </w:rPr>
+      </w:pPr>
+      <w:r>
+        <w:rPr>
+          <w:color w:val="000000"/>
+        </w:rPr>
+        <w:t xml:space="preserve">These instructions will help you file your </w:t>
+      </w:r>
+      <w:r>
+        <w:rPr>
+          <w:color w:val="000000"/>
+        </w:rPr>
+        <w:t xml:space="preserve">Small </w:t>
+      </w:r>
+      <w:r>
+        <w:rPr>
+          <w:color w:val="000000"/>
+        </w:rPr>
+        <w:t>Claim</w:t>
+      </w:r>
+      <w:r>
+        <w:rPr>
+          <w:color w:val="000000"/>
+        </w:rPr>
+        <w:t>s Affidavit</w:t>
+      </w:r>
+      <w:r>
+        <w:rPr>
+          <w:color w:val="000000"/>
+        </w:rPr>
+        <w:t xml:space="preserve"> in small claims court. You can print the instructions and use them as a checklist.</w:t>
       </w:r>
     </w:p>
     <w:p>
@@ -359,21 +374,7 @@
         <w:rPr>
           <w:color w:val="222222"/>
         </w:rPr>
-        <w:t xml:space="preserve"> is only available for </w:t>
-      </w:r>
-      <w:proofErr w:type="gramStart"/>
-      <w:r>
-        <w:rPr>
-          <w:color w:val="222222"/>
-        </w:rPr>
-        <w:t>some courts</w:t>
-      </w:r>
-      <w:proofErr w:type="gramEnd"/>
-      <w:r>
-        <w:rPr>
-          <w:color w:val="222222"/>
-        </w:rPr>
-        <w:t xml:space="preserve">. Even in courts where it is available, you can only use it for some case types. The State Court Administrative Office keeps a </w:t>
+        <w:t xml:space="preserve"> is only available for some courts. Even in courts where it is available, you can only use it for some case types. The State Court Administrative Office keeps a </w:t>
       </w:r>
       <w:hyperlink r:id="rId10">
         <w:r>
@@ -452,7 +453,19 @@
         <w:rPr>
           <w:color w:val="000000"/>
         </w:rPr>
-        <w:t xml:space="preserve">You must sign the Affidavit and Claim form in front of a notary public or a court clerk. </w:t>
+        <w:t xml:space="preserve">You must sign the </w:t>
+      </w:r>
+      <w:r>
+        <w:rPr>
+          <w:color w:val="000000"/>
+        </w:rPr>
+        <w:t>Small Claims Affidavit</w:t>
+      </w:r>
+      <w:r>
+        <w:rPr>
+          <w:color w:val="000000"/>
+        </w:rPr>
+        <w:t xml:space="preserve"> form in front of a notary public or a court clerk. </w:t>
       </w:r>
       <w:r>
         <w:rPr>
@@ -473,7 +486,19 @@
         <w:rPr>
           <w:color w:val="222222"/>
         </w:rPr>
-        <w:t>You will need to show the clerk or notary photo identification, such as your driver’s license or state identification card, before you sign the Affidavit and Claim.</w:t>
+        <w:t xml:space="preserve">You will need to show the clerk or notary photo identification, such as your driver’s license or state identification card, before you sign the </w:t>
+      </w:r>
+      <w:r>
+        <w:rPr>
+          <w:color w:val="000000"/>
+        </w:rPr>
+        <w:t>Small Claims Affidavit</w:t>
+      </w:r>
+      <w:r>
+        <w:rPr>
+          <w:color w:val="222222"/>
+        </w:rPr>
+        <w:t>.</w:t>
       </w:r>
     </w:p>
     <w:p>
@@ -488,21 +513,25 @@
         <w:rPr>
           <w:color w:val="222222"/>
         </w:rPr>
-        <w:t xml:space="preserve">If you're signing the Affidavit and Claim in front of a court clerk, make four copies before you sign your documents. Make at least one copy of your judgment. Bring </w:t>
-      </w:r>
-      <w:proofErr w:type="gramStart"/>
-      <w:r>
-        <w:rPr>
-          <w:color w:val="222222"/>
-        </w:rPr>
-        <w:t>all of</w:t>
-      </w:r>
-      <w:proofErr w:type="gramEnd"/>
-      <w:r>
-        <w:rPr>
-          <w:color w:val="222222"/>
-        </w:rPr>
-        <w:t xml:space="preserve"> the copies with you to the court clerk.</w:t>
+        <w:t xml:space="preserve">If you're signing the </w:t>
+      </w:r>
+      <w:r>
+        <w:rPr>
+          <w:color w:val="000000"/>
+        </w:rPr>
+        <w:t>Small Claims Affidavit</w:t>
+      </w:r>
+      <w:r>
+        <w:rPr>
+          <w:color w:val="222222"/>
+        </w:rPr>
+        <w:t xml:space="preserve"> </w:t>
+      </w:r>
+      <w:r>
+        <w:rPr>
+          <w:color w:val="222222"/>
+        </w:rPr>
+        <w:t>in front of a court clerk, make four copies before you sign your documents. Make at least one copy of your judgment. Bring all of the copies with you to the court clerk.</w:t>
       </w:r>
     </w:p>
     <w:p>
@@ -517,7 +546,25 @@
         <w:rPr>
           <w:color w:val="222222"/>
         </w:rPr>
-        <w:t>If you're signing the Affidavit and Claim in front of a notary, make four copies after you sign your documents.</w:t>
+        <w:t xml:space="preserve">If you're signing the </w:t>
+      </w:r>
+      <w:r>
+        <w:rPr>
+          <w:color w:val="000000"/>
+        </w:rPr>
+        <w:t>Small Claims Affidavit</w:t>
+      </w:r>
+      <w:r>
+        <w:rPr>
+          <w:color w:val="222222"/>
+        </w:rPr>
+        <w:t xml:space="preserve"> </w:t>
+      </w:r>
+      <w:r>
+        <w:rPr>
+          <w:color w:val="222222"/>
+        </w:rPr>
+        <w:t>in front of a notary, make four copies after you sign your documents.</w:t>
       </w:r>
     </w:p>
     <w:p>
@@ -529,6 +576,7 @@
         <w:rPr>
           <w:color w:val="222222"/>
         </w:rPr>
+        <w:lastRenderedPageBreak/>
         <w:t xml:space="preserve">No matter how you sign, </w:t>
       </w:r>
       <w:r>
@@ -561,7 +609,6 @@
       <w:bookmarkStart w:id="3" w:name="_heading=h.e5f53lywmgbs" w:colFirst="0" w:colLast="0"/>
       <w:bookmarkEnd w:id="3"/>
       <w:r>
-        <w:lastRenderedPageBreak/>
         <w:t>Step 3: File your forms and pay the filing fee</w:t>
       </w:r>
     </w:p>
@@ -577,7 +624,19 @@
         <w:rPr>
           <w:color w:val="222222"/>
         </w:rPr>
-        <w:t>File your Affidavit and Claim form and the copies with the Court Clerk’s office in the court you selected.</w:t>
+        <w:t xml:space="preserve">File your </w:t>
+      </w:r>
+      <w:r>
+        <w:rPr>
+          <w:color w:val="000000"/>
+        </w:rPr>
+        <w:t>Small Claims Affidavit</w:t>
+      </w:r>
+      <w:r>
+        <w:rPr>
+          <w:color w:val="222222"/>
+        </w:rPr>
+        <w:t xml:space="preserve"> form and the copies with the Court Clerk’s office in the court you selected.</w:t>
       </w:r>
     </w:p>
     <w:p>
@@ -615,42 +674,40 @@
         <w:rPr>
           <w:color w:val="222222"/>
         </w:rPr>
-        <w:t xml:space="preserve">The case-type code for small claims cases is "SC." Look for your court on the </w:t>
-      </w:r>
-      <w:proofErr w:type="gramStart"/>
-      <w:r>
-        <w:rPr>
-          <w:color w:val="222222"/>
-        </w:rPr>
-        <w:t>chart, and</w:t>
-      </w:r>
-      <w:proofErr w:type="gramEnd"/>
-      <w:r>
-        <w:rPr>
-          <w:color w:val="222222"/>
-        </w:rPr>
-        <w:t xml:space="preserve"> then check to see if "SC" is listed as one of the case types they take for e-Filing. </w:t>
-      </w:r>
-    </w:p>
-    <w:p>
-      <w:pPr>
-        <w:pBdr>
-          <w:top w:val="nil"/>
-          <w:left w:val="nil"/>
-          <w:bottom w:val="nil"/>
-          <w:right w:val="nil"/>
-          <w:between w:val="nil"/>
-        </w:pBdr>
-        <w:spacing w:after="160" w:line="276" w:lineRule="auto"/>
-        <w:rPr>
-          <w:color w:val="000000"/>
-        </w:rPr>
-      </w:pPr>
-      <w:r>
-        <w:rPr>
-          <w:color w:val="000000"/>
-        </w:rPr>
-        <w:t>You must pay the filing fee when you file your Affidavit and Claim. The filing fee is based on how much money you’re asking for. The filing fee is:</w:t>
+        <w:t xml:space="preserve">The case-type code for small claims cases is "SC." Look for your court on the chart, and then check to see if "SC" is listed as one of the case types they take for e-Filing. </w:t>
+      </w:r>
+    </w:p>
+    <w:p>
+      <w:pPr>
+        <w:pBdr>
+          <w:top w:val="nil"/>
+          <w:left w:val="nil"/>
+          <w:bottom w:val="nil"/>
+          <w:right w:val="nil"/>
+          <w:between w:val="nil"/>
+        </w:pBdr>
+        <w:spacing w:after="160" w:line="276" w:lineRule="auto"/>
+        <w:rPr>
+          <w:color w:val="000000"/>
+        </w:rPr>
+      </w:pPr>
+      <w:r>
+        <w:rPr>
+          <w:color w:val="000000"/>
+        </w:rPr>
+        <w:t xml:space="preserve">You must pay the filing fee when you file your </w:t>
+      </w:r>
+      <w:r>
+        <w:rPr>
+          <w:color w:val="000000"/>
+        </w:rPr>
+        <w:t>Small Claims Affidavit</w:t>
+      </w:r>
+      <w:r>
+        <w:rPr>
+          <w:color w:val="000000"/>
+        </w:rPr>
+        <w:t>. The filing fee is based on how much money you’re asking for. The filing fee is:</w:t>
       </w:r>
     </w:p>
     <w:p>
@@ -782,56 +839,54 @@
         <w:rPr>
           <w:color w:val="000000"/>
         </w:rPr>
-        <w:t xml:space="preserve"> tool. Your case will not start until you pay the filing </w:t>
+        <w:t xml:space="preserve"> tool. Your case will not start until you pay the filing fee or the fee waiver is approved.</w:t>
+      </w:r>
+    </w:p>
+    <w:p>
+      <w:pPr>
+        <w:pBdr>
+          <w:top w:val="nil"/>
+          <w:left w:val="nil"/>
+          <w:bottom w:val="nil"/>
+          <w:right w:val="nil"/>
+          <w:between w:val="nil"/>
+        </w:pBdr>
+        <w:spacing w:after="160" w:line="276" w:lineRule="auto"/>
+        <w:rPr>
+          <w:color w:val="000000"/>
+        </w:rPr>
+      </w:pPr>
+      <w:r>
+        <w:rPr>
+          <w:color w:val="000000"/>
+        </w:rPr>
+        <w:t xml:space="preserve">When you file your documents, the court clerk will </w:t>
       </w:r>
       <w:proofErr w:type="gramStart"/>
       <w:r>
         <w:rPr>
           <w:color w:val="000000"/>
         </w:rPr>
-        <w:t>fee</w:t>
+        <w:t>make arrangements</w:t>
       </w:r>
       <w:proofErr w:type="gramEnd"/>
       <w:r>
         <w:rPr>
           <w:color w:val="000000"/>
         </w:rPr>
-        <w:t xml:space="preserve"> or the fee waiver is approved.</w:t>
-      </w:r>
-    </w:p>
-    <w:p>
-      <w:pPr>
-        <w:pBdr>
-          <w:top w:val="nil"/>
-          <w:left w:val="nil"/>
-          <w:bottom w:val="nil"/>
-          <w:right w:val="nil"/>
-          <w:between w:val="nil"/>
-        </w:pBdr>
-        <w:spacing w:after="160" w:line="276" w:lineRule="auto"/>
-        <w:rPr>
-          <w:color w:val="000000"/>
-        </w:rPr>
-      </w:pPr>
-      <w:r>
-        <w:rPr>
-          <w:color w:val="000000"/>
-        </w:rPr>
-        <w:t xml:space="preserve">When you file your documents, the court clerk will </w:t>
-      </w:r>
-      <w:proofErr w:type="gramStart"/>
-      <w:r>
-        <w:rPr>
-          <w:color w:val="000000"/>
-        </w:rPr>
-        <w:t>make arrangements</w:t>
-      </w:r>
-      <w:proofErr w:type="gramEnd"/>
-      <w:r>
-        <w:rPr>
-          <w:color w:val="000000"/>
-        </w:rPr>
-        <w:t xml:space="preserve"> to serve a copy of your Affidavit and Claim on each defendant. You must pay the cost of this service. You must serve the other party by personal service or by certified mail, return receipt requested. The cost of service can be as little as $15.00 for certified mail, or as much as $26.00 plus mileage for personal service.</w:t>
+        <w:t xml:space="preserve"> to serve a copy of your </w:t>
+      </w:r>
+      <w:r>
+        <w:rPr>
+          <w:color w:val="000000"/>
+        </w:rPr>
+        <w:t>Small Claims Affidavit</w:t>
+      </w:r>
+      <w:r>
+        <w:rPr>
+          <w:color w:val="000000"/>
+        </w:rPr>
+        <w:t xml:space="preserve"> on each defendant. You must pay the cost of this service. You must serve the other party by personal service or by certified mail, return receipt requested. The cost of service can be as little as $15.00 for certified mail, or as much as $26.00 plus mileage for personal service.</w:t>
       </w:r>
     </w:p>
     <w:p>
@@ -894,7 +949,19 @@
         <w:rPr>
           <w:color w:val="000000"/>
         </w:rPr>
-        <w:t>If you file by mail, you need to contact the court to find out how much it will cost to serve the Affidavit and Claim on the Defendant. Send the clerk:</w:t>
+        <w:t xml:space="preserve">If you file by mail, you need to contact the court to find out how much it will cost to serve the </w:t>
+      </w:r>
+      <w:r>
+        <w:rPr>
+          <w:color w:val="000000"/>
+        </w:rPr>
+        <w:t>Small Claims Affidavit</w:t>
+      </w:r>
+      <w:r>
+        <w:rPr>
+          <w:color w:val="000000"/>
+        </w:rPr>
+        <w:t xml:space="preserve"> on the Defendant. Send the clerk:</w:t>
       </w:r>
     </w:p>
     <w:p>
@@ -919,7 +986,19 @@
         <w:rPr>
           <w:color w:val="000000"/>
         </w:rPr>
-        <w:t>all four signed and notarized copies of the Affidavit and Claim,</w:t>
+        <w:t xml:space="preserve">all four signed and notarized copies of the </w:t>
+      </w:r>
+      <w:r>
+        <w:rPr>
+          <w:color w:val="000000"/>
+        </w:rPr>
+        <w:t>Small Claims Affidavit</w:t>
+      </w:r>
+      <w:r>
+        <w:rPr>
+          <w:color w:val="000000"/>
+        </w:rPr>
+        <w:t>,</w:t>
       </w:r>
     </w:p>
     <w:p>
@@ -1009,6 +1088,7 @@
         <w:rPr>
           <w:color w:val="222222"/>
         </w:rPr>
+        <w:lastRenderedPageBreak/>
         <w:t xml:space="preserve">If you are filing by e-mail or using </w:t>
       </w:r>
       <w:proofErr w:type="spellStart"/>
@@ -1044,7 +1124,6 @@
       <w:bookmarkStart w:id="4" w:name="_heading=h.mqy17vhwbu03" w:colFirst="0" w:colLast="0"/>
       <w:bookmarkEnd w:id="4"/>
       <w:r>
-        <w:lastRenderedPageBreak/>
         <w:t>Step 4: Prepare for your hearing</w:t>
       </w:r>
     </w:p>
@@ -1108,16 +1187,8 @@
         <w:rPr>
           <w:color w:val="000000"/>
         </w:rPr>
-        <w:t xml:space="preserve">Any witnesses you ask to </w:t>
-      </w:r>
-      <w:proofErr w:type="gramStart"/>
-      <w:r>
-        <w:rPr>
-          <w:color w:val="000000"/>
-        </w:rPr>
-        <w:t>speak</w:t>
-      </w:r>
-      <w:proofErr w:type="gramEnd"/>
+        <w:t>Any witnesses you ask to speak</w:t>
+      </w:r>
       <w:r>
         <w:rPr>
           <w:color w:val="000000"/>
@@ -1254,21 +1325,7 @@
         <w:rPr>
           <w:color w:val="000000"/>
         </w:rPr>
-        <w:t xml:space="preserve">Remember that when people represent themselves in court, they are expected to follow the same </w:t>
-      </w:r>
-      <w:proofErr w:type="gramStart"/>
-      <w:r>
-        <w:rPr>
-          <w:color w:val="000000"/>
-        </w:rPr>
-        <w:t>rules</w:t>
-      </w:r>
-      <w:proofErr w:type="gramEnd"/>
-      <w:r>
-        <w:rPr>
-          <w:color w:val="000000"/>
-        </w:rPr>
-        <w:t xml:space="preserve"> an attorney does.</w:t>
+        <w:t>Remember that when people represent themselves in court, they are expected to follow the same rules an attorney does.</w:t>
       </w:r>
     </w:p>
     <w:p>
@@ -1310,21 +1367,7 @@
         <w:rPr>
           <w:color w:val="000000"/>
         </w:rPr>
-        <w:t xml:space="preserve">Answer the judge’s or magistrate’s questions clearly and directly. If the judge or magistrate wants to hear from your other witnesses, ask them to tell the court what they know or </w:t>
-      </w:r>
-      <w:proofErr w:type="gramStart"/>
-      <w:r>
-        <w:rPr>
-          <w:color w:val="000000"/>
-        </w:rPr>
-        <w:t>saw</w:t>
-      </w:r>
-      <w:proofErr w:type="gramEnd"/>
-      <w:r>
-        <w:rPr>
-          <w:color w:val="000000"/>
-        </w:rPr>
-        <w:t xml:space="preserve"> regarding your situation.</w:t>
+        <w:t>Answer the judge’s or magistrate’s questions clearly and directly. If the judge or magistrate wants to hear from your other witnesses, ask them to tell the court what they know or saw regarding your situation.</w:t>
       </w:r>
     </w:p>
     <w:p>
@@ -1355,6 +1398,7 @@
       <w:bookmarkStart w:id="6" w:name="_heading=h.u9idiagtvejb" w:colFirst="0" w:colLast="0"/>
       <w:bookmarkEnd w:id="6"/>
       <w:r>
+        <w:lastRenderedPageBreak/>
         <w:t>Step 6: Get your order signed by the judge or magistrate</w:t>
       </w:r>
     </w:p>
@@ -1407,7 +1451,6 @@
       <w:bookmarkStart w:id="7" w:name="_heading=h.i81vw6aybp7z" w:colFirst="0" w:colLast="0"/>
       <w:bookmarkEnd w:id="7"/>
       <w:r>
-        <w:lastRenderedPageBreak/>
         <w:t>Step 7: Collecting a money judgment</w:t>
       </w:r>
     </w:p>
@@ -1475,7 +1518,7 @@
 </file>
 
 <file path=word/numbering.xml><?xml version="1.0" encoding="utf-8"?>
-<w:numbering xmlns:wpc="http://schemas.microsoft.com/office/word/2010/wordprocessingCanvas" xmlns:cx="http://schemas.microsoft.com/office/drawing/2014/chartex" xmlns:cx1="http://schemas.microsoft.com/office/drawing/2015/9/8/chartex" xmlns:cx2="http://schemas.microsoft.com/office/drawing/2015/10/21/chartex" xmlns:cx3="http://schemas.microsoft.com/office/drawing/2016/5/9/chartex" xmlns:cx4="http://schemas.microsoft.com/office/drawing/2016/5/10/chartex" xmlns:cx5="http://schemas.microsoft.com/office/drawing/2016/5/11/chartex" xmlns:cx6="http://schemas.microsoft.com/office/drawing/2016/5/12/chartex" xmlns:cx7="http://schemas.microsoft.com/office/drawing/2016/5/13/chartex" xmlns:cx8="http://schemas.microsoft.com/office/drawing/2016/5/14/chartex" xmlns:mc="http://schemas.openxmlformats.org/markup-compatibility/2006" xmlns:aink="http://schemas.microsoft.com/office/drawing/2016/ink" xmlns:am3d="http://schemas.microsoft.com/office/drawing/2017/model3d" xmlns:o="urn:schemas-microsoft-com:office:office" xmlns:oel="http://schemas.microsoft.com/office/2019/extlst" xmlns:r="http://schemas.openxmlformats.org/officeDocument/2006/relationships" xmlns:m="http://schemas.openxmlformats.org/officeDocument/2006/math" xmlns:v="urn:schemas-microsoft-com:vml" xmlns:wp14="http://schemas.microsoft.com/office/word/2010/wordprocessingDrawing" xmlns:wp="http://schemas.openxmlformats.org/drawingml/2006/wordprocessingDrawing" xmlns:w10="urn:schemas-microsoft-com:office:word" xmlns:w="http://schemas.openxmlformats.org/wordprocessingml/2006/main" xmlns:w14="http://schemas.microsoft.com/office/word/2010/wordml" xmlns:w15="http://schemas.microsoft.com/office/word/2012/wordml" xmlns:w16cex="http://schemas.microsoft.com/office/word/2018/wordml/cex" xmlns:w16cid="http://schemas.microsoft.com/office/word/2016/wordml/cid" xmlns:w16="http://schemas.microsoft.com/office/word/2018/wordml" xmlns:w16du="http://schemas.microsoft.com/office/word/2023/wordml/word16du" xmlns:w16sdtdh="http://schemas.microsoft.com/office/word/2020/wordml/sdtdatahash" xmlns:w16sdtfl="http://schemas.microsoft.com/office/word/2024/wordml/sdtformatlock" xmlns:w16se="http://schemas.microsoft.com/office/word/2015/wordml/symex" xmlns:wpg="http://schemas.microsoft.com/office/word/2010/wordprocessingGroup" xmlns:wpi="http://schemas.microsoft.com/office/word/2010/wordprocessingInk" xmlns:wne="http://schemas.microsoft.com/office/word/2006/wordml" xmlns:wps="http://schemas.microsoft.com/office/word/2010/wordprocessingShape" mc:Ignorable="w14 w15 w16se w16cid w16 w16cex w16sdtdh w16sdtfl w16du wp14">
+<w:numbering xmlns:wpc="http://schemas.microsoft.com/office/word/2010/wordprocessingCanvas" xmlns:cx="http://schemas.microsoft.com/office/drawing/2014/chartex" xmlns:cx1="http://schemas.microsoft.com/office/drawing/2015/9/8/chartex" xmlns:cx2="http://schemas.microsoft.com/office/drawing/2015/10/21/chartex" xmlns:cx3="http://schemas.microsoft.com/office/drawing/2016/5/9/chartex" xmlns:cx4="http://schemas.microsoft.com/office/drawing/2016/5/10/chartex" xmlns:cx5="http://schemas.microsoft.com/office/drawing/2016/5/11/chartex" xmlns:cx6="http://schemas.microsoft.com/office/drawing/2016/5/12/chartex" xmlns:cx7="http://schemas.microsoft.com/office/drawing/2016/5/13/chartex" xmlns:cx8="http://schemas.microsoft.com/office/drawing/2016/5/14/chartex" xmlns:mc="http://schemas.openxmlformats.org/markup-compatibility/2006" xmlns:m="http://schemas.openxmlformats.org/officeDocument/2006/math" xmlns:aink="http://schemas.microsoft.com/office/drawing/2016/ink" xmlns:am3d="http://schemas.microsoft.com/office/drawing/2017/model3d" xmlns:oel="http://schemas.microsoft.com/office/2019/extlst" xmlns:r="http://schemas.openxmlformats.org/officeDocument/2006/relationships" xmlns:wp14="http://schemas.microsoft.com/office/word/2010/wordprocessingDrawing" xmlns:wp="http://schemas.openxmlformats.org/drawingml/2006/wordprocessingDrawing" xmlns:wpg="http://schemas.microsoft.com/office/word/2010/wordprocessingGroup" xmlns:wpi="http://schemas.microsoft.com/office/word/2010/wordprocessingInk" xmlns:wps="http://schemas.microsoft.com/office/word/2010/wordprocessingShape" xmlns:o="urn:schemas-microsoft-com:office:office" xmlns:v="urn:schemas-microsoft-com:vml" xmlns:w10="urn:schemas-microsoft-com:office:word" xmlns:w="http://schemas.openxmlformats.org/wordprocessingml/2006/main" xmlns:w14="http://schemas.microsoft.com/office/word/2010/wordml" xmlns:w15="http://schemas.microsoft.com/office/word/2012/wordml" xmlns:w16cex="http://schemas.microsoft.com/office/word/2018/wordml/cex" xmlns:w16cid="http://schemas.microsoft.com/office/word/2016/wordml/cid" xmlns:w16="http://schemas.microsoft.com/office/word/2018/wordml" xmlns:w16sdtdh="http://schemas.microsoft.com/office/word/2020/wordml/sdtdatahash" xmlns:w16sdtfl="http://schemas.microsoft.com/office/word/2024/wordml/sdtformatlock" xmlns:w16se="http://schemas.microsoft.com/office/word/2015/wordml/symex" xmlns:w16du="http://schemas.microsoft.com/office/word/2023/wordml/word16du" xmlns:wne="http://schemas.microsoft.com/office/word/2006/wordml" mc:Ignorable="w14 w15 w16se w16cid w16 w16cex w16sdtdh w16sdtfl w16du wp14">
   <w:abstractNum w:abstractNumId="0" w15:restartNumberingAfterBreak="0">
     <w:nsid w:val="2C92161A"/>
     <w:multiLevelType w:val="multilevel"/>
@@ -1834,7 +1877,7 @@
 </file>
 
 <file path=word/styles.xml><?xml version="1.0" encoding="utf-8"?>
-<w:styles xmlns:mc="http://schemas.openxmlformats.org/markup-compatibility/2006" xmlns:r="http://schemas.openxmlformats.org/officeDocument/2006/relationships" xmlns:w="http://schemas.openxmlformats.org/wordprocessingml/2006/main" xmlns:w14="http://schemas.microsoft.com/office/word/2010/wordml" xmlns:w15="http://schemas.microsoft.com/office/word/2012/wordml" xmlns:w16cex="http://schemas.microsoft.com/office/word/2018/wordml/cex" xmlns:w16cid="http://schemas.microsoft.com/office/word/2016/wordml/cid" xmlns:w16="http://schemas.microsoft.com/office/word/2018/wordml" xmlns:w16du="http://schemas.microsoft.com/office/word/2023/wordml/word16du" xmlns:w16sdtdh="http://schemas.microsoft.com/office/word/2020/wordml/sdtdatahash" xmlns:w16sdtfl="http://schemas.microsoft.com/office/word/2024/wordml/sdtformatlock" xmlns:w16se="http://schemas.microsoft.com/office/word/2015/wordml/symex" mc:Ignorable="w14 w15 w16se w16cid w16 w16cex w16sdtdh w16sdtfl w16du">
+<w:styles xmlns:mc="http://schemas.openxmlformats.org/markup-compatibility/2006" xmlns:r="http://schemas.openxmlformats.org/officeDocument/2006/relationships" xmlns:w="http://schemas.openxmlformats.org/wordprocessingml/2006/main" xmlns:w14="http://schemas.microsoft.com/office/word/2010/wordml" xmlns:w15="http://schemas.microsoft.com/office/word/2012/wordml" xmlns:w16cex="http://schemas.microsoft.com/office/word/2018/wordml/cex" xmlns:w16cid="http://schemas.microsoft.com/office/word/2016/wordml/cid" xmlns:w16="http://schemas.microsoft.com/office/word/2018/wordml" xmlns:w16sdtdh="http://schemas.microsoft.com/office/word/2020/wordml/sdtdatahash" xmlns:w16sdtfl="http://schemas.microsoft.com/office/word/2024/wordml/sdtformatlock" xmlns:w16se="http://schemas.microsoft.com/office/word/2015/wordml/symex" xmlns:w16du="http://schemas.microsoft.com/office/word/2023/wordml/word16du" mc:Ignorable="w14 w15 w16se w16cid w16 w16cex w16sdtdh w16sdtfl w16du">
   <w:docDefaults>
     <w:rPrDefault>
       <w:rPr>

</xml_diff>

<commit_message>
Re-added MM edits: multiple defendants review block question; removed extra NOH from end of DC 84; plaintiff and defendant email fields in DC 84; new title in attachment blocks; new title in checklist template
</commit_message>
<xml_diff>
--- a/docassemble/SmallClClaimAndAffidavit/data/templates/small_claims_checklist.docx
+++ b/docassemble/SmallClClaimAndAffidavit/data/templates/small_claims_checklist.docx
@@ -111,21 +111,10 @@
       </w:pPr>
       <w:r>
         <w:lastRenderedPageBreak/>
-        <w:t xml:space="preserve">Instructions – How to File </w:t>
-      </w:r>
-      <w:proofErr w:type="gramStart"/>
-      <w:r>
-        <w:t>an</w:t>
-      </w:r>
-      <w:proofErr w:type="gramEnd"/>
-      <w:r>
-        <w:t xml:space="preserve"> Small </w:t>
-      </w:r>
-      <w:r>
-        <w:t>Claim</w:t>
-      </w:r>
-      <w:r>
-        <w:t>s Affidavit</w:t>
+        <w:t xml:space="preserve">Instructions – How to File a </w:t>
+      </w:r>
+      <w:r>
+        <w:t>Small Claims Affidavit</w:t>
       </w:r>
       <w:r>
         <w:t xml:space="preserve"> in Small Claims Court</w:t>
@@ -155,19 +144,7 @@
         <w:rPr>
           <w:color w:val="000000"/>
         </w:rPr>
-        <w:t xml:space="preserve">Small </w:t>
-      </w:r>
-      <w:r>
-        <w:rPr>
-          <w:color w:val="000000"/>
-        </w:rPr>
-        <w:t>Claim</w:t>
-      </w:r>
-      <w:r>
-        <w:rPr>
-          <w:color w:val="000000"/>
-        </w:rPr>
-        <w:t>s Affidavit</w:t>
+        <w:t>Small Claims Affidavit</w:t>
       </w:r>
       <w:r>
         <w:rPr>
@@ -185,6 +162,20 @@
       <w:r>
         <w:t>Step 1: Prepare your forms and find out how you will file</w:t>
       </w:r>
+      <w:r>
+        <w:t xml:space="preserve">. For more information on small claims, review the </w:t>
+      </w:r>
+      <w:hyperlink r:id="rId7" w:history="1">
+        <w:r>
+          <w:rPr>
+            <w:rStyle w:val="Hyperlink"/>
+          </w:rPr>
+          <w:t>Small Claims Overview form 84 info</w:t>
+        </w:r>
+      </w:hyperlink>
+      <w:r>
+        <w:t>.</w:t>
+      </w:r>
     </w:p>
     <w:p>
       <w:pPr>
@@ -206,7 +197,7 @@
         </w:rPr>
         <w:t xml:space="preserve">Use the </w:t>
       </w:r>
-      <w:hyperlink r:id="rId7">
+      <w:hyperlink r:id="rId8">
         <w:r>
           <w:rPr>
             <w:color w:val="0563C1"/>
@@ -338,7 +329,7 @@
         </w:rPr>
         <w:t xml:space="preserve">You can find contact information for your court on the </w:t>
       </w:r>
-      <w:hyperlink r:id="rId8">
+      <w:hyperlink r:id="rId9">
         <w:r>
           <w:rPr>
             <w:color w:val="1155CC"/>
@@ -359,7 +350,7 @@
         <w:shd w:val="clear" w:color="auto" w:fill="FFFFFF"/>
         <w:spacing w:after="160" w:line="276" w:lineRule="auto"/>
       </w:pPr>
-      <w:hyperlink r:id="rId9">
+      <w:hyperlink r:id="rId10">
         <w:proofErr w:type="spellStart"/>
         <w:r>
           <w:rPr>
@@ -376,7 +367,7 @@
         </w:rPr>
         <w:t xml:space="preserve"> is only available for some courts. Even in courts where it is available, you can only use it for some case types. The State Court Administrative Office keeps a </w:t>
       </w:r>
-      <w:hyperlink r:id="rId10">
+      <w:hyperlink r:id="rId11">
         <w:r>
           <w:rPr>
             <w:color w:val="1155CC"/>
@@ -391,7 +382,7 @@
         </w:rPr>
         <w:t xml:space="preserve">. To learn more, read </w:t>
       </w:r>
-      <w:hyperlink r:id="rId11">
+      <w:hyperlink r:id="rId12">
         <w:r>
           <w:rPr>
             <w:color w:val="1155CC"/>
@@ -490,7 +481,7 @@
       </w:r>
       <w:r>
         <w:rPr>
-          <w:color w:val="000000"/>
+          <w:color w:val="222222"/>
         </w:rPr>
         <w:t>Small Claims Affidavit</w:t>
       </w:r>
@@ -517,7 +508,7 @@
       </w:r>
       <w:r>
         <w:rPr>
-          <w:color w:val="000000"/>
+          <w:color w:val="222222"/>
         </w:rPr>
         <w:t>Small Claims Affidavit</w:t>
       </w:r>
@@ -525,13 +516,7 @@
         <w:rPr>
           <w:color w:val="222222"/>
         </w:rPr>
-        <w:t xml:space="preserve"> </w:t>
-      </w:r>
-      <w:r>
-        <w:rPr>
-          <w:color w:val="222222"/>
-        </w:rPr>
-        <w:t>in front of a court clerk, make four copies before you sign your documents. Make at least one copy of your judgment. Bring all of the copies with you to the court clerk.</w:t>
+        <w:t xml:space="preserve"> in front of a court clerk, make four copies before you sign your documents. Make at least one copy of your judgment. Bring all of the copies with you to the court clerk.</w:t>
       </w:r>
     </w:p>
     <w:p>
@@ -550,7 +535,7 @@
       </w:r>
       <w:r>
         <w:rPr>
-          <w:color w:val="000000"/>
+          <w:color w:val="222222"/>
         </w:rPr>
         <w:t>Small Claims Affidavit</w:t>
       </w:r>
@@ -558,13 +543,7 @@
         <w:rPr>
           <w:color w:val="222222"/>
         </w:rPr>
-        <w:t xml:space="preserve"> </w:t>
-      </w:r>
-      <w:r>
-        <w:rPr>
-          <w:color w:val="222222"/>
-        </w:rPr>
-        <w:t>in front of a notary, make four copies after you sign your documents.</w:t>
+        <w:t xml:space="preserve"> in front of a notary, make four copies after you sign your documents.</w:t>
       </w:r>
     </w:p>
     <w:p>
@@ -628,7 +607,7 @@
       </w:r>
       <w:r>
         <w:rPr>
-          <w:color w:val="000000"/>
+          <w:color w:val="222222"/>
         </w:rPr>
         <w:t>Small Claims Affidavit</w:t>
       </w:r>
@@ -826,7 +805,7 @@
         </w:rPr>
         <w:t xml:space="preserve">If you can’t afford to pay the filing fee, you can ask the court to waive your fees. The form you can use for this is the </w:t>
       </w:r>
-      <w:hyperlink r:id="rId12">
+      <w:hyperlink r:id="rId13">
         <w:r>
           <w:rPr>
             <w:color w:val="0563C1"/>
@@ -1187,13 +1166,7 @@
         <w:rPr>
           <w:color w:val="000000"/>
         </w:rPr>
-        <w:t>Any witnesses you ask to speak</w:t>
-      </w:r>
-      <w:r>
-        <w:rPr>
-          <w:color w:val="000000"/>
-        </w:rPr>
-        <w:t xml:space="preserve"> on your behalf may write a letter or sign an affidavit, but it is best if they appear in court as well. If you need someone to testify who is not willing to come to court, you can get an order to appear. You may want to talk to a lawyer about how to do this.</w:t>
+        <w:t>Any witnesses you ask to speak on your behalf may write a letter or sign an affidavit, but it is best if they appear in court as well. If you need someone to testify who is not willing to come to court, you can get an order to appear. You may want to talk to a lawyer about how to do this.</w:t>
       </w:r>
     </w:p>
     <w:p>
@@ -1218,7 +1191,7 @@
         </w:rPr>
         <w:t xml:space="preserve">Information about appearing in court is available in the article </w:t>
       </w:r>
-      <w:hyperlink r:id="rId13">
+      <w:hyperlink r:id="rId14">
         <w:r>
           <w:rPr>
             <w:color w:val="1155CC"/>
@@ -1476,7 +1449,7 @@
         </w:rPr>
         <w:t xml:space="preserve">If the court finds in your favor, and the judgment is not paid immediately, you will need to take steps to collect the money. See the One Court of Justice website about </w:t>
       </w:r>
-      <w:hyperlink r:id="rId14">
+      <w:hyperlink r:id="rId15">
         <w:r>
           <w:rPr>
             <w:color w:val="0563C1"/>
@@ -1491,7 +1464,7 @@
         </w:rPr>
         <w:t xml:space="preserve">, or our article </w:t>
       </w:r>
-      <w:hyperlink r:id="rId15">
+      <w:hyperlink r:id="rId16">
         <w:r>
           <w:rPr>
             <w:color w:val="0563C1"/>
@@ -2567,6 +2540,18 @@
       <w:szCs w:val="48"/>
     </w:rPr>
   </w:style>
+  <w:style w:type="character" w:styleId="UnresolvedMention">
+    <w:name w:val="Unresolved Mention"/>
+    <w:basedOn w:val="DefaultParagraphFont"/>
+    <w:uiPriority w:val="99"/>
+    <w:semiHidden/>
+    <w:unhideWhenUsed/>
+    <w:rsid w:val="00151F6E"/>
+    <w:rPr>
+      <w:color w:val="605E5C"/>
+      <w:shd w:val="clear" w:color="auto" w:fill="E1DFDD"/>
+    </w:rPr>
+  </w:style>
 </w:styles>
 </file>
 

</xml_diff>

<commit_message>
minor wording changes in interview and instructions; edit addendum link; update e-filing info
</commit_message>
<xml_diff>
--- a/docassemble/SmallClClaimAndAffidavit/data/templates/small_claims_checklist.docx
+++ b/docassemble/SmallClClaimAndAffidavit/data/templates/small_claims_checklist.docx
@@ -1,6 +1,6 @@
 
 <file path=word/document.xml><?xml version="1.0" encoding="utf-8"?>
-<w:document xmlns:wpc="http://schemas.microsoft.com/office/word/2010/wordprocessingCanvas" xmlns:cx="http://schemas.microsoft.com/office/drawing/2014/chartex" xmlns:cx1="http://schemas.microsoft.com/office/drawing/2015/9/8/chartex" xmlns:cx2="http://schemas.microsoft.com/office/drawing/2015/10/21/chartex" xmlns:cx3="http://schemas.microsoft.com/office/drawing/2016/5/9/chartex" xmlns:cx4="http://schemas.microsoft.com/office/drawing/2016/5/10/chartex" xmlns:cx5="http://schemas.microsoft.com/office/drawing/2016/5/11/chartex" xmlns:cx6="http://schemas.microsoft.com/office/drawing/2016/5/12/chartex" xmlns:cx7="http://schemas.microsoft.com/office/drawing/2016/5/13/chartex" xmlns:cx8="http://schemas.microsoft.com/office/drawing/2016/5/14/chartex" xmlns:mc="http://schemas.openxmlformats.org/markup-compatibility/2006" xmlns:m="http://schemas.openxmlformats.org/officeDocument/2006/math" xmlns:aink="http://schemas.microsoft.com/office/drawing/2016/ink" xmlns:am3d="http://schemas.microsoft.com/office/drawing/2017/model3d" xmlns:oel="http://schemas.microsoft.com/office/2019/extlst" xmlns:r="http://schemas.openxmlformats.org/officeDocument/2006/relationships" xmlns:wp14="http://schemas.microsoft.com/office/word/2010/wordprocessingDrawing" xmlns:wp="http://schemas.openxmlformats.org/drawingml/2006/wordprocessingDrawing" xmlns:wpg="http://schemas.microsoft.com/office/word/2010/wordprocessingGroup" xmlns:wpi="http://schemas.microsoft.com/office/word/2010/wordprocessingInk" xmlns:wps="http://schemas.microsoft.com/office/word/2010/wordprocessingShape" xmlns:o="urn:schemas-microsoft-com:office:office" xmlns:v="urn:schemas-microsoft-com:vml" xmlns:w10="urn:schemas-microsoft-com:office:word" xmlns:w="http://schemas.openxmlformats.org/wordprocessingml/2006/main" xmlns:w14="http://schemas.microsoft.com/office/word/2010/wordml" xmlns:w15="http://schemas.microsoft.com/office/word/2012/wordml" xmlns:w16cex="http://schemas.microsoft.com/office/word/2018/wordml/cex" xmlns:w16cid="http://schemas.microsoft.com/office/word/2016/wordml/cid" xmlns:w16="http://schemas.microsoft.com/office/word/2018/wordml" xmlns:w16sdtdh="http://schemas.microsoft.com/office/word/2020/wordml/sdtdatahash" xmlns:w16sdtfl="http://schemas.microsoft.com/office/word/2024/wordml/sdtformatlock" xmlns:w16se="http://schemas.microsoft.com/office/word/2015/wordml/symex" xmlns:w16du="http://schemas.microsoft.com/office/word/2023/wordml/word16du" xmlns:wne="http://schemas.microsoft.com/office/word/2006/wordml" mc:Ignorable="w14 w15 w16se w16cid w16 w16cex w16sdtdh w16sdtfl w16du wp14">
+<w:document xmlns:wpc="http://schemas.microsoft.com/office/word/2010/wordprocessingCanvas" xmlns:cx="http://schemas.microsoft.com/office/drawing/2014/chartex" xmlns:cx1="http://schemas.microsoft.com/office/drawing/2015/9/8/chartex" xmlns:cx2="http://schemas.microsoft.com/office/drawing/2015/10/21/chartex" xmlns:cx3="http://schemas.microsoft.com/office/drawing/2016/5/9/chartex" xmlns:cx4="http://schemas.microsoft.com/office/drawing/2016/5/10/chartex" xmlns:cx5="http://schemas.microsoft.com/office/drawing/2016/5/11/chartex" xmlns:cx6="http://schemas.microsoft.com/office/drawing/2016/5/12/chartex" xmlns:cx7="http://schemas.microsoft.com/office/drawing/2016/5/13/chartex" xmlns:cx8="http://schemas.microsoft.com/office/drawing/2016/5/14/chartex" xmlns:mc="http://schemas.openxmlformats.org/markup-compatibility/2006" xmlns:aink="http://schemas.microsoft.com/office/drawing/2016/ink" xmlns:am3d="http://schemas.microsoft.com/office/drawing/2017/model3d" xmlns:o="urn:schemas-microsoft-com:office:office" xmlns:oel="http://schemas.microsoft.com/office/2019/extlst" xmlns:r="http://schemas.openxmlformats.org/officeDocument/2006/relationships" xmlns:m="http://schemas.openxmlformats.org/officeDocument/2006/math" xmlns:v="urn:schemas-microsoft-com:vml" xmlns:wp14="http://schemas.microsoft.com/office/word/2010/wordprocessingDrawing" xmlns:wp="http://schemas.openxmlformats.org/drawingml/2006/wordprocessingDrawing" xmlns:w10="urn:schemas-microsoft-com:office:word" xmlns:w="http://schemas.openxmlformats.org/wordprocessingml/2006/main" xmlns:w14="http://schemas.microsoft.com/office/word/2010/wordml" xmlns:w15="http://schemas.microsoft.com/office/word/2012/wordml" xmlns:w16cex="http://schemas.microsoft.com/office/word/2018/wordml/cex" xmlns:w16cid="http://schemas.microsoft.com/office/word/2016/wordml/cid" xmlns:w16="http://schemas.microsoft.com/office/word/2018/wordml" xmlns:w16du="http://schemas.microsoft.com/office/word/2023/wordml/word16du" xmlns:w16sdtdh="http://schemas.microsoft.com/office/word/2020/wordml/sdtdatahash" xmlns:w16sdtfl="http://schemas.microsoft.com/office/word/2024/wordml/sdtformatlock" xmlns:w16se="http://schemas.microsoft.com/office/word/2015/wordml/symex" xmlns:wpg="http://schemas.microsoft.com/office/word/2010/wordprocessingGroup" xmlns:wpi="http://schemas.microsoft.com/office/word/2010/wordprocessingInk" xmlns:wne="http://schemas.microsoft.com/office/word/2006/wordml" xmlns:wps="http://schemas.microsoft.com/office/word/2010/wordprocessingShape" mc:Ignorable="w14 w15 w16se w16cid w16 w16cex w16sdtdh w16sdtfl w16du wp14">
   <w:body>
     <w:p>
       <w:bookmarkStart w:id="0" w:name="_heading=h.dq0av64i9ak" w:colFirst="0" w:colLast="0"/>
@@ -152,29 +152,38 @@
         </w:rPr>
         <w:t xml:space="preserve"> in small claims court. You can print the instructions and use them as a checklist.</w:t>
       </w:r>
-    </w:p>
-    <w:p>
-      <w:pPr>
-        <w:pStyle w:val="Heading3"/>
-      </w:pPr>
-      <w:bookmarkStart w:id="1" w:name="_heading=h.2bnxk1sjhadg" w:colFirst="0" w:colLast="0"/>
-      <w:bookmarkEnd w:id="1"/>
-      <w:r>
-        <w:t>Step 1: Prepare your forms and find out how you will file</w:t>
-      </w:r>
-      <w:r>
-        <w:t xml:space="preserve">. For more information on small claims, review the </w:t>
+      <w:r>
+        <w:rPr>
+          <w:color w:val="000000"/>
+        </w:rPr>
+        <w:t xml:space="preserve"> </w:t>
+      </w:r>
+      <w:r>
+        <w:t xml:space="preserve">For more information on small claims, review the </w:t>
       </w:r>
       <w:hyperlink r:id="rId7" w:history="1">
         <w:r>
           <w:rPr>
             <w:rStyle w:val="Hyperlink"/>
           </w:rPr>
-          <w:t>Small Claims Overview form 84 info</w:t>
+          <w:t>Small Claims Overview form 84info</w:t>
         </w:r>
       </w:hyperlink>
       <w:r>
         <w:t>.</w:t>
+      </w:r>
+    </w:p>
+    <w:p>
+      <w:pPr>
+        <w:pStyle w:val="Heading3"/>
+      </w:pPr>
+      <w:bookmarkStart w:id="1" w:name="_heading=h.2bnxk1sjhadg" w:colFirst="0" w:colLast="0"/>
+      <w:bookmarkEnd w:id="1"/>
+      <w:r>
+        <w:t>Step 1: Prepare your forms and find out how you will file</w:t>
+      </w:r>
+      <w:r>
+        <w:t xml:space="preserve">. </w:t>
       </w:r>
     </w:p>
     <w:p>
@@ -349,6 +358,10 @@
       <w:pPr>
         <w:shd w:val="clear" w:color="auto" w:fill="FFFFFF"/>
         <w:spacing w:after="160" w:line="276" w:lineRule="auto"/>
+        <w:rPr>
+          <w:b/>
+          <w:bCs/>
+        </w:rPr>
       </w:pPr>
       <w:hyperlink r:id="rId10">
         <w:proofErr w:type="spellStart"/>
@@ -365,34 +378,30 @@
         <w:rPr>
           <w:color w:val="222222"/>
         </w:rPr>
-        <w:t xml:space="preserve"> is only available for some courts. Even in courts where it is available, you can only use it for some case types. The State Court Administrative Office keeps a </w:t>
-      </w:r>
-      <w:hyperlink r:id="rId11">
+        <w:t xml:space="preserve"> is only available for some courts. Even in courts where it is available, you can only use it for some case types. </w:t>
+      </w:r>
+      <w:hyperlink r:id="rId11" w:history="1">
         <w:r>
           <w:rPr>
-            <w:color w:val="1155CC"/>
-            <w:u w:val="single"/>
+            <w:rStyle w:val="Hyperlink"/>
+            <w:b/>
+            <w:bCs/>
           </w:rPr>
-          <w:t>chart of courts that use e-Filing</w:t>
+          <w:t xml:space="preserve">Tap </w:t>
+        </w:r>
+        <w:r>
+          <w:rPr>
+            <w:rStyle w:val="Hyperlink"/>
+            <w:b/>
+            <w:bCs/>
+          </w:rPr>
+          <w:t>here to check if you can e-file your case</w:t>
         </w:r>
       </w:hyperlink>
       <w:r>
         <w:rPr>
-          <w:color w:val="222222"/>
-        </w:rPr>
-        <w:t xml:space="preserve">. To learn more, read </w:t>
-      </w:r>
-      <w:hyperlink r:id="rId12">
-        <w:r>
-          <w:rPr>
-            <w:color w:val="1155CC"/>
-            <w:u w:val="single"/>
-          </w:rPr>
-          <w:t>What Is E-Filing?</w:t>
-        </w:r>
-      </w:hyperlink>
-      <w:r>
-        <w:rPr>
+          <w:b/>
+          <w:bCs/>
           <w:color w:val="222222"/>
         </w:rPr>
         <w:t>.</w:t>
@@ -805,7 +814,7 @@
         </w:rPr>
         <w:t xml:space="preserve">If you can’t afford to pay the filing fee, you can ask the court to waive your fees. The form you can use for this is the </w:t>
       </w:r>
-      <w:hyperlink r:id="rId13">
+      <w:hyperlink r:id="rId12">
         <w:r>
           <w:rPr>
             <w:color w:val="0563C1"/>
@@ -839,21 +848,7 @@
         <w:rPr>
           <w:color w:val="000000"/>
         </w:rPr>
-        <w:t xml:space="preserve">When you file your documents, the court clerk will </w:t>
-      </w:r>
-      <w:proofErr w:type="gramStart"/>
-      <w:r>
-        <w:rPr>
-          <w:color w:val="000000"/>
-        </w:rPr>
-        <w:t>make arrangements</w:t>
-      </w:r>
-      <w:proofErr w:type="gramEnd"/>
-      <w:r>
-        <w:rPr>
-          <w:color w:val="000000"/>
-        </w:rPr>
-        <w:t xml:space="preserve"> to serve a copy of your </w:t>
+        <w:t xml:space="preserve">When you file your documents, the court clerk will make arrangements to serve a copy of your </w:t>
       </w:r>
       <w:r>
         <w:rPr>
@@ -1191,7 +1186,7 @@
         </w:rPr>
         <w:t xml:space="preserve">Information about appearing in court is available in the article </w:t>
       </w:r>
-      <w:hyperlink r:id="rId14">
+      <w:hyperlink r:id="rId13">
         <w:r>
           <w:rPr>
             <w:color w:val="1155CC"/>
@@ -1447,15 +1442,48 @@
         <w:rPr>
           <w:color w:val="000000"/>
         </w:rPr>
-        <w:t xml:space="preserve">If the court finds in your favor, and the judgment is not paid immediately, you will need to take steps to collect the money. See the One Court of Justice website about </w:t>
-      </w:r>
-      <w:hyperlink r:id="rId15">
+        <w:t xml:space="preserve">If the court finds in your favor, and the judgment is not paid immediately, you will need to take steps to collect the money. </w:t>
+      </w:r>
+      <w:r>
+        <w:rPr>
+          <w:color w:val="000000"/>
+        </w:rPr>
+        <w:t>Read</w:t>
+      </w:r>
+      <w:r>
+        <w:rPr>
+          <w:color w:val="000000"/>
+        </w:rPr>
+        <w:t xml:space="preserve"> </w:t>
+      </w:r>
+      <w:hyperlink r:id="rId14">
         <w:r>
           <w:rPr>
             <w:color w:val="0563C1"/>
             <w:u w:val="single"/>
           </w:rPr>
-          <w:t>collecting a money judgment</w:t>
+          <w:t>Form DC 85info - C</w:t>
+        </w:r>
+        <w:r>
+          <w:rPr>
+            <w:color w:val="0563C1"/>
+            <w:u w:val="single"/>
+          </w:rPr>
+          <w:t xml:space="preserve">ollecting a </w:t>
+        </w:r>
+        <w:r>
+          <w:rPr>
+            <w:color w:val="0563C1"/>
+            <w:u w:val="single"/>
+          </w:rPr>
+          <w:t>Small Claims J</w:t>
+        </w:r>
+        <w:r>
+          <w:rPr>
+            <w:color w:val="0563C1"/>
+            <w:u w:val="single"/>
+          </w:rPr>
+          <w:t>udgment</w:t>
         </w:r>
       </w:hyperlink>
       <w:r>
@@ -1464,7 +1492,7 @@
         </w:rPr>
         <w:t xml:space="preserve">, or our article </w:t>
       </w:r>
-      <w:hyperlink r:id="rId16">
+      <w:hyperlink r:id="rId15">
         <w:r>
           <w:rPr>
             <w:color w:val="0563C1"/>
@@ -1491,7 +1519,7 @@
 </file>
 
 <file path=word/numbering.xml><?xml version="1.0" encoding="utf-8"?>
-<w:numbering xmlns:wpc="http://schemas.microsoft.com/office/word/2010/wordprocessingCanvas" xmlns:cx="http://schemas.microsoft.com/office/drawing/2014/chartex" xmlns:cx1="http://schemas.microsoft.com/office/drawing/2015/9/8/chartex" xmlns:cx2="http://schemas.microsoft.com/office/drawing/2015/10/21/chartex" xmlns:cx3="http://schemas.microsoft.com/office/drawing/2016/5/9/chartex" xmlns:cx4="http://schemas.microsoft.com/office/drawing/2016/5/10/chartex" xmlns:cx5="http://schemas.microsoft.com/office/drawing/2016/5/11/chartex" xmlns:cx6="http://schemas.microsoft.com/office/drawing/2016/5/12/chartex" xmlns:cx7="http://schemas.microsoft.com/office/drawing/2016/5/13/chartex" xmlns:cx8="http://schemas.microsoft.com/office/drawing/2016/5/14/chartex" xmlns:mc="http://schemas.openxmlformats.org/markup-compatibility/2006" xmlns:m="http://schemas.openxmlformats.org/officeDocument/2006/math" xmlns:aink="http://schemas.microsoft.com/office/drawing/2016/ink" xmlns:am3d="http://schemas.microsoft.com/office/drawing/2017/model3d" xmlns:oel="http://schemas.microsoft.com/office/2019/extlst" xmlns:r="http://schemas.openxmlformats.org/officeDocument/2006/relationships" xmlns:wp14="http://schemas.microsoft.com/office/word/2010/wordprocessingDrawing" xmlns:wp="http://schemas.openxmlformats.org/drawingml/2006/wordprocessingDrawing" xmlns:wpg="http://schemas.microsoft.com/office/word/2010/wordprocessingGroup" xmlns:wpi="http://schemas.microsoft.com/office/word/2010/wordprocessingInk" xmlns:wps="http://schemas.microsoft.com/office/word/2010/wordprocessingShape" xmlns:o="urn:schemas-microsoft-com:office:office" xmlns:v="urn:schemas-microsoft-com:vml" xmlns:w10="urn:schemas-microsoft-com:office:word" xmlns:w="http://schemas.openxmlformats.org/wordprocessingml/2006/main" xmlns:w14="http://schemas.microsoft.com/office/word/2010/wordml" xmlns:w15="http://schemas.microsoft.com/office/word/2012/wordml" xmlns:w16cex="http://schemas.microsoft.com/office/word/2018/wordml/cex" xmlns:w16cid="http://schemas.microsoft.com/office/word/2016/wordml/cid" xmlns:w16="http://schemas.microsoft.com/office/word/2018/wordml" xmlns:w16sdtdh="http://schemas.microsoft.com/office/word/2020/wordml/sdtdatahash" xmlns:w16sdtfl="http://schemas.microsoft.com/office/word/2024/wordml/sdtformatlock" xmlns:w16se="http://schemas.microsoft.com/office/word/2015/wordml/symex" xmlns:w16du="http://schemas.microsoft.com/office/word/2023/wordml/word16du" xmlns:wne="http://schemas.microsoft.com/office/word/2006/wordml" mc:Ignorable="w14 w15 w16se w16cid w16 w16cex w16sdtdh w16sdtfl w16du wp14">
+<w:numbering xmlns:wpc="http://schemas.microsoft.com/office/word/2010/wordprocessingCanvas" xmlns:cx="http://schemas.microsoft.com/office/drawing/2014/chartex" xmlns:cx1="http://schemas.microsoft.com/office/drawing/2015/9/8/chartex" xmlns:cx2="http://schemas.microsoft.com/office/drawing/2015/10/21/chartex" xmlns:cx3="http://schemas.microsoft.com/office/drawing/2016/5/9/chartex" xmlns:cx4="http://schemas.microsoft.com/office/drawing/2016/5/10/chartex" xmlns:cx5="http://schemas.microsoft.com/office/drawing/2016/5/11/chartex" xmlns:cx6="http://schemas.microsoft.com/office/drawing/2016/5/12/chartex" xmlns:cx7="http://schemas.microsoft.com/office/drawing/2016/5/13/chartex" xmlns:cx8="http://schemas.microsoft.com/office/drawing/2016/5/14/chartex" xmlns:mc="http://schemas.openxmlformats.org/markup-compatibility/2006" xmlns:aink="http://schemas.microsoft.com/office/drawing/2016/ink" xmlns:am3d="http://schemas.microsoft.com/office/drawing/2017/model3d" xmlns:o="urn:schemas-microsoft-com:office:office" xmlns:oel="http://schemas.microsoft.com/office/2019/extlst" xmlns:r="http://schemas.openxmlformats.org/officeDocument/2006/relationships" xmlns:m="http://schemas.openxmlformats.org/officeDocument/2006/math" xmlns:v="urn:schemas-microsoft-com:vml" xmlns:wp14="http://schemas.microsoft.com/office/word/2010/wordprocessingDrawing" xmlns:wp="http://schemas.openxmlformats.org/drawingml/2006/wordprocessingDrawing" xmlns:w10="urn:schemas-microsoft-com:office:word" xmlns:w="http://schemas.openxmlformats.org/wordprocessingml/2006/main" xmlns:w14="http://schemas.microsoft.com/office/word/2010/wordml" xmlns:w15="http://schemas.microsoft.com/office/word/2012/wordml" xmlns:w16cex="http://schemas.microsoft.com/office/word/2018/wordml/cex" xmlns:w16cid="http://schemas.microsoft.com/office/word/2016/wordml/cid" xmlns:w16="http://schemas.microsoft.com/office/word/2018/wordml" xmlns:w16du="http://schemas.microsoft.com/office/word/2023/wordml/word16du" xmlns:w16sdtdh="http://schemas.microsoft.com/office/word/2020/wordml/sdtdatahash" xmlns:w16sdtfl="http://schemas.microsoft.com/office/word/2024/wordml/sdtformatlock" xmlns:w16se="http://schemas.microsoft.com/office/word/2015/wordml/symex" xmlns:wpg="http://schemas.microsoft.com/office/word/2010/wordprocessingGroup" xmlns:wpi="http://schemas.microsoft.com/office/word/2010/wordprocessingInk" xmlns:wne="http://schemas.microsoft.com/office/word/2006/wordml" xmlns:wps="http://schemas.microsoft.com/office/word/2010/wordprocessingShape" mc:Ignorable="w14 w15 w16se w16cid w16 w16cex w16sdtdh w16sdtfl w16du wp14">
   <w:abstractNum w:abstractNumId="0" w15:restartNumberingAfterBreak="0">
     <w:nsid w:val="2C92161A"/>
     <w:multiLevelType w:val="multilevel"/>
@@ -1850,7 +1878,7 @@
 </file>
 
 <file path=word/styles.xml><?xml version="1.0" encoding="utf-8"?>
-<w:styles xmlns:mc="http://schemas.openxmlformats.org/markup-compatibility/2006" xmlns:r="http://schemas.openxmlformats.org/officeDocument/2006/relationships" xmlns:w="http://schemas.openxmlformats.org/wordprocessingml/2006/main" xmlns:w14="http://schemas.microsoft.com/office/word/2010/wordml" xmlns:w15="http://schemas.microsoft.com/office/word/2012/wordml" xmlns:w16cex="http://schemas.microsoft.com/office/word/2018/wordml/cex" xmlns:w16cid="http://schemas.microsoft.com/office/word/2016/wordml/cid" xmlns:w16="http://schemas.microsoft.com/office/word/2018/wordml" xmlns:w16sdtdh="http://schemas.microsoft.com/office/word/2020/wordml/sdtdatahash" xmlns:w16sdtfl="http://schemas.microsoft.com/office/word/2024/wordml/sdtformatlock" xmlns:w16se="http://schemas.microsoft.com/office/word/2015/wordml/symex" xmlns:w16du="http://schemas.microsoft.com/office/word/2023/wordml/word16du" mc:Ignorable="w14 w15 w16se w16cid w16 w16cex w16sdtdh w16sdtfl w16du">
+<w:styles xmlns:mc="http://schemas.openxmlformats.org/markup-compatibility/2006" xmlns:r="http://schemas.openxmlformats.org/officeDocument/2006/relationships" xmlns:w="http://schemas.openxmlformats.org/wordprocessingml/2006/main" xmlns:w14="http://schemas.microsoft.com/office/word/2010/wordml" xmlns:w15="http://schemas.microsoft.com/office/word/2012/wordml" xmlns:w16cex="http://schemas.microsoft.com/office/word/2018/wordml/cex" xmlns:w16cid="http://schemas.microsoft.com/office/word/2016/wordml/cid" xmlns:w16="http://schemas.microsoft.com/office/word/2018/wordml" xmlns:w16du="http://schemas.microsoft.com/office/word/2023/wordml/word16du" xmlns:w16sdtdh="http://schemas.microsoft.com/office/word/2020/wordml/sdtdatahash" xmlns:w16sdtfl="http://schemas.microsoft.com/office/word/2024/wordml/sdtformatlock" xmlns:w16se="http://schemas.microsoft.com/office/word/2015/wordml/symex" mc:Ignorable="w14 w15 w16se w16cid w16 w16cex w16sdtdh w16sdtfl w16du">
   <w:docDefaults>
     <w:rPrDefault>
       <w:rPr>
@@ -2552,6 +2580,18 @@
       <w:shd w:val="clear" w:color="auto" w:fill="E1DFDD"/>
     </w:rPr>
   </w:style>
+  <w:style w:type="character" w:styleId="FollowedHyperlink">
+    <w:name w:val="FollowedHyperlink"/>
+    <w:basedOn w:val="DefaultParagraphFont"/>
+    <w:uiPriority w:val="99"/>
+    <w:semiHidden/>
+    <w:unhideWhenUsed/>
+    <w:rsid w:val="00525A8F"/>
+    <w:rPr>
+      <w:color w:val="954F72" w:themeColor="followedHyperlink"/>
+      <w:u w:val="single"/>
+    </w:rPr>
+  </w:style>
 </w:styles>
 </file>
 

</xml_diff>